<commit_message>
docs(finance): concrete dates (anchored to gen date) + field explanations
Both finance test docs now render real DD/MM/YYYY dates (computed from the doc
generation date) with the relative offset kept in parentheses, instead of bare
"HÔM NAY ± N". HUONG_DAN_QUY_TRINH also gains a "Giải thích từng trường" block
under each entry table explaining each field's meaning + format.

Co-Authored-By: Claude Opus 4.8 <noreply@anthropic.com>
</commit_message>
<xml_diff>
--- a/docs/HUONG_DAN_QUY_TRINH_TAI_CHINH.docx
+++ b/docs/HUONG_DAN_QUY_TRINH_TAI_CHINH.docx
@@ -1941,21 +1941,80 @@
         <w:rPr>
           <w:b/>
         </w:rPr>
-        <w:t xml:space="preserve">Quy ước ngày:</w:t>
-      </w:r>
-      <w:r>
-        <w:rPr/>
-        <w:t xml:space="preserve"> các ô ngày nhập </w:t>
-      </w:r>
-      <w:r>
-        <w:rPr>
-          <w:b/>
-        </w:rPr>
-        <w:t xml:space="preserve">lệch so với HÔM NAY</w:t>
-      </w:r>
-      <w:r>
-        <w:rPr/>
-        <w:t xml:space="preserve"> (chọn trên lịch). “+20” = hôm nay + 20 ngày; “−12” = hôm nay − 12 ngày.</w:t>
+        <w:t xml:space="preserve">📅 Về NGÀY trong tài liệu:</w:t>
+      </w:r>
+      <w:r>
+        <w:rPr/>
+        <w:t xml:space="preserve"> mọi ngày bên dưới đã được </w:t>
+      </w:r>
+      <w:r>
+        <w:rPr>
+          <w:b/>
+        </w:rPr>
+        <w:t xml:space="preserve">quy đổi sẵn thành ngày cụ thể</w:t>
+      </w:r>
+      <w:r>
+        <w:rPr/>
+        <w:t xml:space="preserve">, lấy </w:t>
+      </w:r>
+      <w:r>
+        <w:rPr>
+          <w:b/>
+        </w:rPr>
+        <w:t xml:space="preserve">mốc = ngày tạo tài liệu này (25/06/2026)</w:t>
+      </w:r>
+      <w:r>
+        <w:rPr/>
+        <w:t xml:space="preserve">. Phần in nhạt trong ngoặc — ví dụ </w:t>
+      </w:r>
+      <w:r>
+        <w:rPr>
+          <w:i/>
+        </w:rPr>
+        <w:t xml:space="preserve">(hôm nay − 60 ngày)</w:t>
+      </w:r>
+      <w:r>
+        <w:rPr/>
+        <w:t xml:space="preserve"> — chỉ nói rõ ngày đó cách hôm nay bao xa. Nếu bạn nhập vào </w:t>
+      </w:r>
+      <w:r>
+        <w:rPr>
+          <w:b/>
+        </w:rPr>
+        <w:t xml:space="preserve">một ngày khác</w:t>
+      </w:r>
+      <w:r>
+        <w:rPr/>
+        <w:t xml:space="preserve">, hãy chọn lại ngày theo công thức trong ngoặc để đèn cảnh báo / tuổi nợ hiện </w:t>
+      </w:r>
+      <w:r>
+        <w:rPr>
+          <w:b/>
+        </w:rPr>
+        <w:t xml:space="preserve">đúng như cột mô tả</w:t>
+      </w:r>
+      <w:r>
+        <w:rPr/>
+        <w:t xml:space="preserve">.</w:t>
+      </w:r>
+    </w:p>
+    <w:p>
+      <w:pPr>
+        <w:spacing w:lineRule="auto"/>
+      </w:pPr>
+      <w:r>
+        <w:rPr/>
+        <w:t xml:space="preserve">Dưới mỗi bảng có mục </w:t>
+      </w:r>
+      <w:r>
+        <w:rPr>
+          <w:b/>
+        </w:rPr>
+        <w:t xml:space="preserve">📝 Giải thích từng trường</w:t>
+      </w:r>
+      <w:r>
+        <w:rPr/>
+        <w:t xml:space="preserve"> — nêu rõ ý nghĩa &amp; định dạng cần nhập.</w:t>
       </w:r>
     </w:p>
     <w:p>
@@ -2336,6 +2395,162 @@
       </w:pPr>
       <w:r>
         <w:rPr/>
+      </w:r>
+    </w:p>
+    <w:p>
+      <w:pPr>
+        <w:spacing w:lineRule="auto"/>
+      </w:pPr>
+      <w:r>
+        <w:rPr>
+          <w:color w:val="1B4D3E"/>
+          <w:b/>
+        </w:rPr>
+        <w:t xml:space="preserve">📝 Giải thích từng trường:</w:t>
+      </w:r>
+    </w:p>
+    <w:p>
+      <w:pPr>
+        <w:numPr>
+          <w:ilvl w:val="0"/>
+          <w:numId w:val="5"/>
+        </w:numPr>
+        <w:spacing w:lineRule="auto"/>
+      </w:pPr>
+      <w:r>
+        <w:rPr>
+          <w:b/>
+        </w:rPr>
+        <w:t xml:space="preserve">Ngân hàng</w:t>
+      </w:r>
+      <w:r>
+        <w:rPr/>
+        <w:t xml:space="preserve"> — tên NH cấp hạn mức (theo hợp đồng tín dụng).</w:t>
+      </w:r>
+    </w:p>
+    <w:p>
+      <w:pPr>
+        <w:numPr>
+          <w:ilvl w:val="0"/>
+          <w:numId w:val="5"/>
+        </w:numPr>
+        <w:spacing w:lineRule="auto"/>
+      </w:pPr>
+      <w:r>
+        <w:rPr>
+          <w:b/>
+        </w:rPr>
+        <w:t xml:space="preserve">Số HĐTD</w:t>
+      </w:r>
+      <w:r>
+        <w:rPr/>
+        <w:t xml:space="preserve"> — số </w:t>
+      </w:r>
+      <w:r>
+        <w:rPr>
+          <w:b/>
+        </w:rPr>
+        <w:t xml:space="preserve">Hợp đồng tín dụng</w:t>
+      </w:r>
+      <w:r>
+        <w:rPr/>
+        <w:t xml:space="preserve"> do NH cấp — nhập đúng theo chứng từ; các phần sau (khoản vay, tiền gửi, tài sản) sẽ “chọn” đúng số này.</w:t>
+      </w:r>
+    </w:p>
+    <w:p>
+      <w:pPr>
+        <w:numPr>
+          <w:ilvl w:val="0"/>
+          <w:numId w:val="5"/>
+        </w:numPr>
+        <w:spacing w:lineRule="auto"/>
+      </w:pPr>
+      <w:r>
+        <w:rPr>
+          <w:b/>
+        </w:rPr>
+        <w:t xml:space="preserve">Hạn mức (VNĐ)</w:t>
+      </w:r>
+      <w:r>
+        <w:rPr/>
+        <w:t xml:space="preserve"> — tổng tiền NH cho vay tối đa — coi như “bể” tín dụng. </w:t>
+      </w:r>
+      <w:r>
+        <w:rPr>
+          <w:b/>
+        </w:rPr>
+        <w:t xml:space="preserve">Room</w:t>
+      </w:r>
+      <w:r>
+        <w:rPr/>
+        <w:t xml:space="preserve"> còn lại = Hạn mức − tổng đang vay.</w:t>
+      </w:r>
+    </w:p>
+    <w:p>
+      <w:pPr>
+        <w:numPr>
+          <w:ilvl w:val="0"/>
+          <w:numId w:val="5"/>
+        </w:numPr>
+        <w:spacing w:lineRule="auto"/>
+      </w:pPr>
+      <w:r>
+        <w:rPr>
+          <w:b/>
+        </w:rPr>
+        <w:t xml:space="preserve">Loại</w:t>
+      </w:r>
+      <w:r>
+        <w:rPr/>
+        <w:t xml:space="preserve"> — bản chất hạn mức: Vay vốn / Chiết khấu bộ chứng từ / Bảo lãnh… (theo HĐTD).</w:t>
+      </w:r>
+    </w:p>
+    <w:p>
+      <w:pPr>
+        <w:numPr>
+          <w:ilvl w:val="0"/>
+          <w:numId w:val="5"/>
+        </w:numPr>
+        <w:spacing w:lineRule="auto"/>
+      </w:pPr>
+      <w:r>
+        <w:rPr>
+          <w:b/>
+        </w:rPr>
+        <w:t xml:space="preserve">Lãi suất (%/năm)</w:t>
+      </w:r>
+      <w:r>
+        <w:rPr/>
+        <w:t xml:space="preserve"> — lãi suất gốc của hạn mức (mỗi khoản vay có thể ghi đè lãi suất riêng).</w:t>
+      </w:r>
+    </w:p>
+    <w:p>
+      <w:pPr>
+        <w:numPr>
+          <w:ilvl w:val="0"/>
+          <w:numId w:val="5"/>
+        </w:numPr>
+        <w:spacing w:lineRule="auto"/>
+      </w:pPr>
+      <w:r>
+        <w:rPr>
+          <w:b/>
+        </w:rPr>
+        <w:t xml:space="preserve">Trạng thái</w:t>
+      </w:r>
+      <w:r>
+        <w:rPr/>
+        <w:t xml:space="preserve"> — để </w:t>
+      </w:r>
+      <w:r>
+        <w:rPr>
+          <w:b/>
+        </w:rPr>
+        <w:t xml:space="preserve">Hiệu lực</w:t>
+      </w:r>
+      <w:r>
+        <w:rPr/>
+        <w:t xml:space="preserve"> thì mới rút vốn được.</w:t>
       </w:r>
     </w:p>
     <w:p>
@@ -2485,7 +2700,7 @@
               <w:rPr>
                 <w:b/>
               </w:rPr>
-              <w:t xml:space="preserve">Giải ngân</w:t>
+              <w:t xml:space="preserve">Ngày giải ngân</w:t>
             </w:r>
           </w:p>
         </w:tc>
@@ -2506,7 +2721,7 @@
               <w:rPr>
                 <w:b/>
               </w:rPr>
-              <w:t xml:space="preserve">Đến hạn</w:t>
+              <w:t xml:space="preserve">Ngày đến hạn</w:t>
             </w:r>
           </w:p>
         </w:tc>
@@ -2527,7 +2742,7 @@
               <w:rPr>
                 <w:b/>
               </w:rPr>
-              <w:t xml:space="preserve">Đèn</w:t>
+              <w:t xml:space="preserve">Đèn dự kiến</w:t>
             </w:r>
           </w:p>
         </w:tc>
@@ -2626,27 +2841,53 @@
               <w:spacing w:lineRule="auto"/>
             </w:pPr>
             <w:r>
-              <w:rPr/>
-              <w:t xml:space="preserve">−60</w:t>
-            </w:r>
-          </w:p>
-        </w:tc>
-        <w:tc>
-          <w:tcPr>
-            <w:tcBorders>
-              <w:top w:val="single" w:sz="8" w:space="0" w:color="888888"/>
-              <w:left w:val="single" w:sz="8" w:space="0" w:color="888888"/>
-              <w:bottom w:val="single" w:sz="8" w:space="0" w:color="888888"/>
-              <w:right w:val="single" w:sz="8" w:space="0" w:color="888888"/>
-            </w:tcBorders>
-          </w:tcPr>
-          <w:p>
-            <w:pPr>
-              <w:spacing w:lineRule="auto"/>
-            </w:pPr>
-            <w:r>
-              <w:rPr/>
-              <w:t xml:space="preserve">+20</w:t>
+              <w:rPr>
+                <w:b/>
+              </w:rPr>
+              <w:t xml:space="preserve">26/04/2026</w:t>
+            </w:r>
+          </w:p>
+          <w:p>
+            <w:pPr>
+              <w:spacing w:lineRule="auto"/>
+            </w:pPr>
+            <w:r>
+              <w:rPr>
+                <w:color w:val="94a3b8"/>
+              </w:rPr>
+              <w:t xml:space="preserve">(hôm nay −60 ngày)</w:t>
+            </w:r>
+          </w:p>
+        </w:tc>
+        <w:tc>
+          <w:tcPr>
+            <w:tcBorders>
+              <w:top w:val="single" w:sz="8" w:space="0" w:color="888888"/>
+              <w:left w:val="single" w:sz="8" w:space="0" w:color="888888"/>
+              <w:bottom w:val="single" w:sz="8" w:space="0" w:color="888888"/>
+              <w:right w:val="single" w:sz="8" w:space="0" w:color="888888"/>
+            </w:tcBorders>
+          </w:tcPr>
+          <w:p>
+            <w:pPr>
+              <w:spacing w:lineRule="auto"/>
+            </w:pPr>
+            <w:r>
+              <w:rPr>
+                <w:b/>
+              </w:rPr>
+              <w:t xml:space="preserve">15/07/2026</w:t>
+            </w:r>
+          </w:p>
+          <w:p>
+            <w:pPr>
+              <w:spacing w:lineRule="auto"/>
+            </w:pPr>
+            <w:r>
+              <w:rPr>
+                <w:color w:val="94a3b8"/>
+              </w:rPr>
+              <w:t xml:space="preserve">(hôm nay +20 ngày)</w:t>
             </w:r>
           </w:p>
         </w:tc>
@@ -2764,27 +3005,53 @@
               <w:spacing w:lineRule="auto"/>
             </w:pPr>
             <w:r>
-              <w:rPr/>
-              <w:t xml:space="preserve">−80</w:t>
-            </w:r>
-          </w:p>
-        </w:tc>
-        <w:tc>
-          <w:tcPr>
-            <w:tcBorders>
-              <w:top w:val="single" w:sz="8" w:space="0" w:color="888888"/>
-              <w:left w:val="single" w:sz="8" w:space="0" w:color="888888"/>
-              <w:bottom w:val="single" w:sz="8" w:space="0" w:color="888888"/>
-              <w:right w:val="single" w:sz="8" w:space="0" w:color="888888"/>
-            </w:tcBorders>
-          </w:tcPr>
-          <w:p>
-            <w:pPr>
-              <w:spacing w:lineRule="auto"/>
-            </w:pPr>
-            <w:r>
-              <w:rPr/>
-              <w:t xml:space="preserve">−2</w:t>
+              <w:rPr>
+                <w:b/>
+              </w:rPr>
+              <w:t xml:space="preserve">06/04/2026</w:t>
+            </w:r>
+          </w:p>
+          <w:p>
+            <w:pPr>
+              <w:spacing w:lineRule="auto"/>
+            </w:pPr>
+            <w:r>
+              <w:rPr>
+                <w:color w:val="94a3b8"/>
+              </w:rPr>
+              <w:t xml:space="preserve">(hôm nay −80 ngày)</w:t>
+            </w:r>
+          </w:p>
+        </w:tc>
+        <w:tc>
+          <w:tcPr>
+            <w:tcBorders>
+              <w:top w:val="single" w:sz="8" w:space="0" w:color="888888"/>
+              <w:left w:val="single" w:sz="8" w:space="0" w:color="888888"/>
+              <w:bottom w:val="single" w:sz="8" w:space="0" w:color="888888"/>
+              <w:right w:val="single" w:sz="8" w:space="0" w:color="888888"/>
+            </w:tcBorders>
+          </w:tcPr>
+          <w:p>
+            <w:pPr>
+              <w:spacing w:lineRule="auto"/>
+            </w:pPr>
+            <w:r>
+              <w:rPr>
+                <w:b/>
+              </w:rPr>
+              <w:t xml:space="preserve">23/06/2026</w:t>
+            </w:r>
+          </w:p>
+          <w:p>
+            <w:pPr>
+              <w:spacing w:lineRule="auto"/>
+            </w:pPr>
+            <w:r>
+              <w:rPr>
+                <w:color w:val="94a3b8"/>
+              </w:rPr>
+              <w:t xml:space="preserve">(hôm nay −2 ngày)</w:t>
             </w:r>
           </w:p>
         </w:tc>
@@ -2902,27 +3169,53 @@
               <w:spacing w:lineRule="auto"/>
             </w:pPr>
             <w:r>
-              <w:rPr/>
-              <w:t xml:space="preserve">−110</w:t>
-            </w:r>
-          </w:p>
-        </w:tc>
-        <w:tc>
-          <w:tcPr>
-            <w:tcBorders>
-              <w:top w:val="single" w:sz="8" w:space="0" w:color="888888"/>
-              <w:left w:val="single" w:sz="8" w:space="0" w:color="888888"/>
-              <w:bottom w:val="single" w:sz="8" w:space="0" w:color="888888"/>
-              <w:right w:val="single" w:sz="8" w:space="0" w:color="888888"/>
-            </w:tcBorders>
-          </w:tcPr>
-          <w:p>
-            <w:pPr>
-              <w:spacing w:lineRule="auto"/>
-            </w:pPr>
-            <w:r>
-              <w:rPr/>
-              <w:t xml:space="preserve">−12</w:t>
+              <w:rPr>
+                <w:b/>
+              </w:rPr>
+              <w:t xml:space="preserve">07/03/2026</w:t>
+            </w:r>
+          </w:p>
+          <w:p>
+            <w:pPr>
+              <w:spacing w:lineRule="auto"/>
+            </w:pPr>
+            <w:r>
+              <w:rPr>
+                <w:color w:val="94a3b8"/>
+              </w:rPr>
+              <w:t xml:space="preserve">(hôm nay −110 ngày)</w:t>
+            </w:r>
+          </w:p>
+        </w:tc>
+        <w:tc>
+          <w:tcPr>
+            <w:tcBorders>
+              <w:top w:val="single" w:sz="8" w:space="0" w:color="888888"/>
+              <w:left w:val="single" w:sz="8" w:space="0" w:color="888888"/>
+              <w:bottom w:val="single" w:sz="8" w:space="0" w:color="888888"/>
+              <w:right w:val="single" w:sz="8" w:space="0" w:color="888888"/>
+            </w:tcBorders>
+          </w:tcPr>
+          <w:p>
+            <w:pPr>
+              <w:spacing w:lineRule="auto"/>
+            </w:pPr>
+            <w:r>
+              <w:rPr>
+                <w:b/>
+              </w:rPr>
+              <w:t xml:space="preserve">13/06/2026</w:t>
+            </w:r>
+          </w:p>
+          <w:p>
+            <w:pPr>
+              <w:spacing w:lineRule="auto"/>
+            </w:pPr>
+            <w:r>
+              <w:rPr>
+                <w:color w:val="94a3b8"/>
+              </w:rPr>
+              <w:t xml:space="preserve">(hôm nay −12 ngày)</w:t>
             </w:r>
           </w:p>
         </w:tc>
@@ -3040,27 +3333,53 @@
               <w:spacing w:lineRule="auto"/>
             </w:pPr>
             <w:r>
-              <w:rPr/>
-              <w:t xml:space="preserve">−85</w:t>
-            </w:r>
-          </w:p>
-        </w:tc>
-        <w:tc>
-          <w:tcPr>
-            <w:tcBorders>
-              <w:top w:val="single" w:sz="8" w:space="0" w:color="888888"/>
-              <w:left w:val="single" w:sz="8" w:space="0" w:color="888888"/>
-              <w:bottom w:val="single" w:sz="8" w:space="0" w:color="888888"/>
-              <w:right w:val="single" w:sz="8" w:space="0" w:color="888888"/>
-            </w:tcBorders>
-          </w:tcPr>
-          <w:p>
-            <w:pPr>
-              <w:spacing w:lineRule="auto"/>
-            </w:pPr>
-            <w:r>
-              <w:rPr/>
-              <w:t xml:space="preserve">+5</w:t>
+              <w:rPr>
+                <w:b/>
+              </w:rPr>
+              <w:t xml:space="preserve">01/04/2026</w:t>
+            </w:r>
+          </w:p>
+          <w:p>
+            <w:pPr>
+              <w:spacing w:lineRule="auto"/>
+            </w:pPr>
+            <w:r>
+              <w:rPr>
+                <w:color w:val="94a3b8"/>
+              </w:rPr>
+              <w:t xml:space="preserve">(hôm nay −85 ngày)</w:t>
+            </w:r>
+          </w:p>
+        </w:tc>
+        <w:tc>
+          <w:tcPr>
+            <w:tcBorders>
+              <w:top w:val="single" w:sz="8" w:space="0" w:color="888888"/>
+              <w:left w:val="single" w:sz="8" w:space="0" w:color="888888"/>
+              <w:bottom w:val="single" w:sz="8" w:space="0" w:color="888888"/>
+              <w:right w:val="single" w:sz="8" w:space="0" w:color="888888"/>
+            </w:tcBorders>
+          </w:tcPr>
+          <w:p>
+            <w:pPr>
+              <w:spacing w:lineRule="auto"/>
+            </w:pPr>
+            <w:r>
+              <w:rPr>
+                <w:b/>
+              </w:rPr>
+              <w:t xml:space="preserve">30/06/2026</w:t>
+            </w:r>
+          </w:p>
+          <w:p>
+            <w:pPr>
+              <w:spacing w:lineRule="auto"/>
+            </w:pPr>
+            <w:r>
+              <w:rPr>
+                <w:color w:val="94a3b8"/>
+              </w:rPr>
+              <w:t xml:space="preserve">(hôm nay +5 ngày)</w:t>
             </w:r>
           </w:p>
         </w:tc>
@@ -3091,6 +3410,162 @@
       </w:pPr>
       <w:r>
         <w:rPr/>
+      </w:r>
+    </w:p>
+    <w:p>
+      <w:pPr>
+        <w:spacing w:lineRule="auto"/>
+      </w:pPr>
+      <w:r>
+        <w:rPr>
+          <w:color w:val="1B4D3E"/>
+          <w:b/>
+        </w:rPr>
+        <w:t xml:space="preserve">📝 Giải thích từng trường:</w:t>
+      </w:r>
+    </w:p>
+    <w:p>
+      <w:pPr>
+        <w:numPr>
+          <w:ilvl w:val="0"/>
+          <w:numId w:val="6"/>
+        </w:numPr>
+        <w:spacing w:lineRule="auto"/>
+      </w:pPr>
+      <w:r>
+        <w:rPr>
+          <w:b/>
+        </w:rPr>
+        <w:t xml:space="preserve">Số khế ước</w:t>
+      </w:r>
+      <w:r>
+        <w:rPr/>
+        <w:t xml:space="preserve"> — số khế ước nhận nợ — mỗi lần giải ngân NH cấp 1 số riêng.</w:t>
+      </w:r>
+    </w:p>
+    <w:p>
+      <w:pPr>
+        <w:numPr>
+          <w:ilvl w:val="0"/>
+          <w:numId w:val="6"/>
+        </w:numPr>
+        <w:spacing w:lineRule="auto"/>
+      </w:pPr>
+      <w:r>
+        <w:rPr>
+          <w:b/>
+        </w:rPr>
+        <w:t xml:space="preserve">Thuộc hạn mức (HĐTD)</w:t>
+      </w:r>
+      <w:r>
+        <w:rPr/>
+        <w:t xml:space="preserve"> — </w:t>
+      </w:r>
+      <w:r>
+        <w:rPr>
+          <w:b/>
+        </w:rPr>
+        <w:t xml:space="preserve">BẮT BUỘC chọn</w:t>
+      </w:r>
+      <w:r>
+        <w:rPr/>
+        <w:t xml:space="preserve"> hạn mức đã tạo ở bước ①; khoản vay “rút” từ đây làm </w:t>
+      </w:r>
+      <w:r>
+        <w:rPr>
+          <w:b/>
+        </w:rPr>
+        <w:t xml:space="preserve">giảm Room</w:t>
+      </w:r>
+      <w:r>
+        <w:rPr/>
+        <w:t xml:space="preserve">.</w:t>
+      </w:r>
+    </w:p>
+    <w:p>
+      <w:pPr>
+        <w:numPr>
+          <w:ilvl w:val="0"/>
+          <w:numId w:val="6"/>
+        </w:numPr>
+        <w:spacing w:lineRule="auto"/>
+      </w:pPr>
+      <w:r>
+        <w:rPr>
+          <w:b/>
+        </w:rPr>
+        <w:t xml:space="preserve">Số vay (VNĐ)</w:t>
+      </w:r>
+      <w:r>
+        <w:rPr/>
+        <w:t xml:space="preserve"> — số tiền giải ngân lần này.</w:t>
+      </w:r>
+    </w:p>
+    <w:p>
+      <w:pPr>
+        <w:numPr>
+          <w:ilvl w:val="0"/>
+          <w:numId w:val="6"/>
+        </w:numPr>
+        <w:spacing w:lineRule="auto"/>
+      </w:pPr>
+      <w:r>
+        <w:rPr>
+          <w:b/>
+        </w:rPr>
+        <w:t xml:space="preserve">Ngày giải ngân</w:t>
+      </w:r>
+      <w:r>
+        <w:rPr/>
+        <w:t xml:space="preserve"> — ngày NH chuyển tiền (trong quá khứ).</w:t>
+      </w:r>
+    </w:p>
+    <w:p>
+      <w:pPr>
+        <w:numPr>
+          <w:ilvl w:val="0"/>
+          <w:numId w:val="6"/>
+        </w:numPr>
+        <w:spacing w:lineRule="auto"/>
+      </w:pPr>
+      <w:r>
+        <w:rPr>
+          <w:b/>
+        </w:rPr>
+        <w:t xml:space="preserve">Ngày đến hạn</w:t>
+      </w:r>
+      <w:r>
+        <w:rPr/>
+        <w:t xml:space="preserve"> — ngày phải trả gốc — </w:t>
+      </w:r>
+      <w:r>
+        <w:rPr>
+          <w:b/>
+        </w:rPr>
+        <w:t xml:space="preserve">đây là mốc tính ĐÈN CIC</w:t>
+      </w:r>
+      <w:r>
+        <w:rPr/>
+        <w:t xml:space="preserve">: quá hạn ≥ 10 ngày = nguy cơ nhảy nhóm.</w:t>
+      </w:r>
+    </w:p>
+    <w:p>
+      <w:pPr>
+        <w:numPr>
+          <w:ilvl w:val="0"/>
+          <w:numId w:val="6"/>
+        </w:numPr>
+        <w:spacing w:lineRule="auto"/>
+      </w:pPr>
+      <w:r>
+        <w:rPr>
+          <w:b/>
+        </w:rPr>
+        <w:t xml:space="preserve">Đèn dự kiến</w:t>
+      </w:r>
+      <w:r>
+        <w:rPr/>
+        <w:t xml:space="preserve"> — KHÔNG nhập — hệ thống tự tô màu từ Ngày đến hạn so với hôm nay (cột này chỉ để bạn đối chiếu kết quả).</w:t>
       </w:r>
     </w:p>
     <w:p>
@@ -3261,7 +3736,7 @@
               <w:rPr>
                 <w:b/>
               </w:rPr>
-              <w:t xml:space="preserve">Đến hạn</w:t>
+              <w:t xml:space="preserve">Ngày đến hạn</w:t>
             </w:r>
           </w:p>
         </w:tc>
@@ -3282,7 +3757,7 @@
               <w:rPr>
                 <w:b/>
               </w:rPr>
-              <w:t xml:space="preserve">Trạng thái</w:t>
+              <w:t xml:space="preserve">Trạng thái dự kiến</w:t>
             </w:r>
           </w:p>
         </w:tc>
@@ -3381,27 +3856,53 @@
               <w:spacing w:lineRule="auto"/>
             </w:pPr>
             <w:r>
-              <w:rPr/>
-              <w:t xml:space="preserve">−180</w:t>
-            </w:r>
-          </w:p>
-        </w:tc>
-        <w:tc>
-          <w:tcPr>
-            <w:tcBorders>
-              <w:top w:val="single" w:sz="8" w:space="0" w:color="888888"/>
-              <w:left w:val="single" w:sz="8" w:space="0" w:color="888888"/>
-              <w:bottom w:val="single" w:sz="8" w:space="0" w:color="888888"/>
-              <w:right w:val="single" w:sz="8" w:space="0" w:color="888888"/>
-            </w:tcBorders>
-          </w:tcPr>
-          <w:p>
-            <w:pPr>
-              <w:spacing w:lineRule="auto"/>
-            </w:pPr>
-            <w:r>
-              <w:rPr/>
-              <w:t xml:space="preserve">+5</w:t>
+              <w:rPr>
+                <w:b/>
+              </w:rPr>
+              <w:t xml:space="preserve">27/12/2025</w:t>
+            </w:r>
+          </w:p>
+          <w:p>
+            <w:pPr>
+              <w:spacing w:lineRule="auto"/>
+            </w:pPr>
+            <w:r>
+              <w:rPr>
+                <w:color w:val="94a3b8"/>
+              </w:rPr>
+              <w:t xml:space="preserve">(hôm nay −180 ngày)</w:t>
+            </w:r>
+          </w:p>
+        </w:tc>
+        <w:tc>
+          <w:tcPr>
+            <w:tcBorders>
+              <w:top w:val="single" w:sz="8" w:space="0" w:color="888888"/>
+              <w:left w:val="single" w:sz="8" w:space="0" w:color="888888"/>
+              <w:bottom w:val="single" w:sz="8" w:space="0" w:color="888888"/>
+              <w:right w:val="single" w:sz="8" w:space="0" w:color="888888"/>
+            </w:tcBorders>
+          </w:tcPr>
+          <w:p>
+            <w:pPr>
+              <w:spacing w:lineRule="auto"/>
+            </w:pPr>
+            <w:r>
+              <w:rPr>
+                <w:b/>
+              </w:rPr>
+              <w:t xml:space="preserve">30/06/2026</w:t>
+            </w:r>
+          </w:p>
+          <w:p>
+            <w:pPr>
+              <w:spacing w:lineRule="auto"/>
+            </w:pPr>
+            <w:r>
+              <w:rPr>
+                <w:color w:val="94a3b8"/>
+              </w:rPr>
+              <w:t xml:space="preserve">(hôm nay +5 ngày)</w:t>
             </w:r>
           </w:p>
         </w:tc>
@@ -3519,27 +4020,53 @@
               <w:spacing w:lineRule="auto"/>
             </w:pPr>
             <w:r>
-              <w:rPr/>
-              <w:t xml:space="preserve">−100</w:t>
-            </w:r>
-          </w:p>
-        </w:tc>
-        <w:tc>
-          <w:tcPr>
-            <w:tcBorders>
-              <w:top w:val="single" w:sz="8" w:space="0" w:color="888888"/>
-              <w:left w:val="single" w:sz="8" w:space="0" w:color="888888"/>
-              <w:bottom w:val="single" w:sz="8" w:space="0" w:color="888888"/>
-              <w:right w:val="single" w:sz="8" w:space="0" w:color="888888"/>
-            </w:tcBorders>
-          </w:tcPr>
-          <w:p>
-            <w:pPr>
-              <w:spacing w:lineRule="auto"/>
-            </w:pPr>
-            <w:r>
-              <w:rPr/>
-              <w:t xml:space="preserve">+150</w:t>
+              <w:rPr>
+                <w:b/>
+              </w:rPr>
+              <w:t xml:space="preserve">17/03/2026</w:t>
+            </w:r>
+          </w:p>
+          <w:p>
+            <w:pPr>
+              <w:spacing w:lineRule="auto"/>
+            </w:pPr>
+            <w:r>
+              <w:rPr>
+                <w:color w:val="94a3b8"/>
+              </w:rPr>
+              <w:t xml:space="preserve">(hôm nay −100 ngày)</w:t>
+            </w:r>
+          </w:p>
+        </w:tc>
+        <w:tc>
+          <w:tcPr>
+            <w:tcBorders>
+              <w:top w:val="single" w:sz="8" w:space="0" w:color="888888"/>
+              <w:left w:val="single" w:sz="8" w:space="0" w:color="888888"/>
+              <w:bottom w:val="single" w:sz="8" w:space="0" w:color="888888"/>
+              <w:right w:val="single" w:sz="8" w:space="0" w:color="888888"/>
+            </w:tcBorders>
+          </w:tcPr>
+          <w:p>
+            <w:pPr>
+              <w:spacing w:lineRule="auto"/>
+            </w:pPr>
+            <w:r>
+              <w:rPr>
+                <w:b/>
+              </w:rPr>
+              <w:t xml:space="preserve">22/11/2026</w:t>
+            </w:r>
+          </w:p>
+          <w:p>
+            <w:pPr>
+              <w:spacing w:lineRule="auto"/>
+            </w:pPr>
+            <w:r>
+              <w:rPr>
+                <w:color w:val="94a3b8"/>
+              </w:rPr>
+              <w:t xml:space="preserve">(hôm nay +150 ngày)</w:t>
             </w:r>
           </w:p>
         </w:tc>
@@ -3657,27 +4184,53 @@
               <w:spacing w:lineRule="auto"/>
             </w:pPr>
             <w:r>
-              <w:rPr/>
-              <w:t xml:space="preserve">−200</w:t>
-            </w:r>
-          </w:p>
-        </w:tc>
-        <w:tc>
-          <w:tcPr>
-            <w:tcBorders>
-              <w:top w:val="single" w:sz="8" w:space="0" w:color="888888"/>
-              <w:left w:val="single" w:sz="8" w:space="0" w:color="888888"/>
-              <w:bottom w:val="single" w:sz="8" w:space="0" w:color="888888"/>
-              <w:right w:val="single" w:sz="8" w:space="0" w:color="888888"/>
-            </w:tcBorders>
-          </w:tcPr>
-          <w:p>
-            <w:pPr>
-              <w:spacing w:lineRule="auto"/>
-            </w:pPr>
-            <w:r>
-              <w:rPr/>
-              <w:t xml:space="preserve">−3</w:t>
+              <w:rPr>
+                <w:b/>
+              </w:rPr>
+              <w:t xml:space="preserve">07/12/2025</w:t>
+            </w:r>
+          </w:p>
+          <w:p>
+            <w:pPr>
+              <w:spacing w:lineRule="auto"/>
+            </w:pPr>
+            <w:r>
+              <w:rPr>
+                <w:color w:val="94a3b8"/>
+              </w:rPr>
+              <w:t xml:space="preserve">(hôm nay −200 ngày)</w:t>
+            </w:r>
+          </w:p>
+        </w:tc>
+        <w:tc>
+          <w:tcPr>
+            <w:tcBorders>
+              <w:top w:val="single" w:sz="8" w:space="0" w:color="888888"/>
+              <w:left w:val="single" w:sz="8" w:space="0" w:color="888888"/>
+              <w:bottom w:val="single" w:sz="8" w:space="0" w:color="888888"/>
+              <w:right w:val="single" w:sz="8" w:space="0" w:color="888888"/>
+            </w:tcBorders>
+          </w:tcPr>
+          <w:p>
+            <w:pPr>
+              <w:spacing w:lineRule="auto"/>
+            </w:pPr>
+            <w:r>
+              <w:rPr>
+                <w:b/>
+              </w:rPr>
+              <w:t xml:space="preserve">22/06/2026</w:t>
+            </w:r>
+          </w:p>
+          <w:p>
+            <w:pPr>
+              <w:spacing w:lineRule="auto"/>
+            </w:pPr>
+            <w:r>
+              <w:rPr>
+                <w:color w:val="94a3b8"/>
+              </w:rPr>
+              <w:t xml:space="preserve">(hôm nay −3 ngày)</w:t>
             </w:r>
           </w:p>
         </w:tc>
@@ -3708,6 +4261,124 @@
       </w:pPr>
       <w:r>
         <w:rPr/>
+      </w:r>
+    </w:p>
+    <w:p>
+      <w:pPr>
+        <w:spacing w:lineRule="auto"/>
+      </w:pPr>
+      <w:r>
+        <w:rPr>
+          <w:color w:val="1B4D3E"/>
+          <w:b/>
+        </w:rPr>
+        <w:t xml:space="preserve">📝 Giải thích từng trường:</w:t>
+      </w:r>
+    </w:p>
+    <w:p>
+      <w:pPr>
+        <w:numPr>
+          <w:ilvl w:val="0"/>
+          <w:numId w:val="7"/>
+        </w:numPr>
+        <w:spacing w:lineRule="auto"/>
+      </w:pPr>
+      <w:r>
+        <w:rPr>
+          <w:b/>
+        </w:rPr>
+        <w:t xml:space="preserve">Số HĐTG</w:t>
+      </w:r>
+      <w:r>
+        <w:rPr/>
+        <w:t xml:space="preserve"> — số hợp đồng tiền gửi / sổ tiết kiệm.</w:t>
+      </w:r>
+    </w:p>
+    <w:p>
+      <w:pPr>
+        <w:numPr>
+          <w:ilvl w:val="0"/>
+          <w:numId w:val="7"/>
+        </w:numPr>
+        <w:spacing w:lineRule="auto"/>
+      </w:pPr>
+      <w:r>
+        <w:rPr>
+          <w:b/>
+        </w:rPr>
+        <w:t xml:space="preserve">Số tiền (VNĐ)</w:t>
+      </w:r>
+      <w:r>
+        <w:rPr/>
+        <w:t xml:space="preserve"> — gốc gửi.</w:t>
+      </w:r>
+    </w:p>
+    <w:p>
+      <w:pPr>
+        <w:numPr>
+          <w:ilvl w:val="0"/>
+          <w:numId w:val="7"/>
+        </w:numPr>
+        <w:spacing w:lineRule="auto"/>
+      </w:pPr>
+      <w:r>
+        <w:rPr>
+          <w:b/>
+        </w:rPr>
+        <w:t xml:space="preserve">Đảm bảo cho</w:t>
+      </w:r>
+      <w:r>
+        <w:rPr/>
+        <w:t xml:space="preserve"> — chọn </w:t>
+      </w:r>
+      <w:r>
+        <w:rPr>
+          <w:b/>
+        </w:rPr>
+        <w:t xml:space="preserve">hạn mức được cầm cố</w:t>
+      </w:r>
+      <w:r>
+        <w:rPr/>
+        <w:t xml:space="preserve"> bằng sổ này (để </w:t>
+      </w:r>
+      <w:r>
+        <w:rPr>
+          <w:i/>
+        </w:rPr>
+        <w:t xml:space="preserve">trống</w:t>
+      </w:r>
+      <w:r>
+        <w:rPr/>
+        <w:t xml:space="preserve"> nếu chỉ là tiền gửi sinh lãi, không cầm cố).</w:t>
+      </w:r>
+    </w:p>
+    <w:p>
+      <w:pPr>
+        <w:numPr>
+          <w:ilvl w:val="0"/>
+          <w:numId w:val="7"/>
+        </w:numPr>
+        <w:spacing w:lineRule="auto"/>
+      </w:pPr>
+      <w:r>
+        <w:rPr>
+          <w:b/>
+        </w:rPr>
+        <w:t xml:space="preserve">Ngày gửi / Ngày đến hạn</w:t>
+      </w:r>
+      <w:r>
+        <w:rPr/>
+        <w:t xml:space="preserve"> — kỳ hạn sổ; hệ thống cảnh báo </w:t>
+      </w:r>
+      <w:r>
+        <w:rPr>
+          <w:b/>
+        </w:rPr>
+        <w:t xml:space="preserve">“cần tái tục”</w:t>
+      </w:r>
+      <w:r>
+        <w:rPr/>
+        <w:t xml:space="preserve"> khi sắp/đã đáo hạn (≤ 7 ngày hoặc đã quá).</w:t>
       </w:r>
     </w:p>
     <w:p>
@@ -3834,7 +4505,7 @@
               <w:rPr>
                 <w:b/>
               </w:rPr>
-              <w:t xml:space="preserve">Định giá</w:t>
+              <w:t xml:space="preserve">Giá trị định giá</w:t>
             </w:r>
           </w:p>
         </w:tc>
@@ -3975,9 +4646,97 @@
       </w:pPr>
       <w:r>
         <w:rPr>
+          <w:color w:val="1B4D3E"/>
+          <w:b/>
+        </w:rPr>
+        <w:t xml:space="preserve">📝 Giải thích từng trường:</w:t>
+      </w:r>
+    </w:p>
+    <w:p>
+      <w:pPr>
+        <w:numPr>
+          <w:ilvl w:val="0"/>
+          <w:numId w:val="8"/>
+        </w:numPr>
+        <w:spacing w:lineRule="auto"/>
+      </w:pPr>
+      <w:r>
+        <w:rPr>
+          <w:b/>
+        </w:rPr>
+        <w:t xml:space="preserve">Tên / Loại tài sản</w:t>
+      </w:r>
+      <w:r>
+        <w:rPr/>
+        <w:t xml:space="preserve"> — mô tả tài sản thế chấp (nhà xưởng, máy móc, xe…).</w:t>
+      </w:r>
+    </w:p>
+    <w:p>
+      <w:pPr>
+        <w:numPr>
+          <w:ilvl w:val="0"/>
+          <w:numId w:val="8"/>
+        </w:numPr>
+        <w:spacing w:lineRule="auto"/>
+      </w:pPr>
+      <w:r>
+        <w:rPr>
+          <w:b/>
+        </w:rPr>
+        <w:t xml:space="preserve">Đảm bảo cho</w:t>
+      </w:r>
+      <w:r>
+        <w:rPr/>
+        <w:t xml:space="preserve"> — hạn mức được thế chấp bằng tài sản này.</w:t>
+      </w:r>
+    </w:p>
+    <w:p>
+      <w:pPr>
+        <w:numPr>
+          <w:ilvl w:val="0"/>
+          <w:numId w:val="8"/>
+        </w:numPr>
+        <w:spacing w:lineRule="auto"/>
+      </w:pPr>
+      <w:r>
+        <w:rPr>
+          <w:b/>
+        </w:rPr>
+        <w:t xml:space="preserve">Giá trị định giá</w:t>
+      </w:r>
+      <w:r>
+        <w:rPr/>
+        <w:t xml:space="preserve"> — giá trị thẩm định của tài sản.</w:t>
+      </w:r>
+    </w:p>
+    <w:p>
+      <w:pPr>
+        <w:numPr>
+          <w:ilvl w:val="0"/>
+          <w:numId w:val="8"/>
+        </w:numPr>
+        <w:spacing w:lineRule="auto"/>
+      </w:pPr>
+      <w:r>
+        <w:rPr>
+          <w:b/>
+        </w:rPr>
+        <w:t xml:space="preserve">Giá trị bảo đảm</w:t>
+      </w:r>
+      <w:r>
+        <w:rPr/>
+        <w:t xml:space="preserve"> — mức NH chấp nhận làm tài sản bảo đảm (thường ~ 60–70% định giá).</w:t>
+      </w:r>
+    </w:p>
+    <w:p>
+      <w:pPr>
+        <w:spacing w:lineRule="auto"/>
+      </w:pPr>
+      <w:r>
+        <w:rPr>
           <w:i/>
         </w:rPr>
-        <w:t xml:space="preserve">Cố ý KHÔNG thêm tài sản cho ACB → ACB thiếu đảm bảo (để test cảnh báo).</w:t>
+        <w:t xml:space="preserve">Cố ý KHÔNG thêm tài sản cho ACB → ACB thiếu đảm bảo (để test cảnh báo “thiếu đảm bảo”).</w:t>
       </w:r>
     </w:p>
     <w:p>
@@ -3990,7 +4749,7 @@
           <w:color w:val="1E3A5F"/>
           <w:sz w:val="25"/>
         </w:rPr>
-        <w:t xml:space="preserve">⑤ Phải thu KH (“Thêm phải thu”) — Tiền tệ USD, Hạn thu để trống</w:t>
+        <w:t xml:space="preserve">⑤ Phải thu KH (“Thêm phải thu”) — Tiền tệ USD, Hạn thu để TRỐNG</w:t>
       </w:r>
     </w:p>
     <w:tbl>
@@ -4106,7 +4865,7 @@
               <w:rPr>
                 <w:b/>
               </w:rPr>
-              <w:t xml:space="preserve">ATD</w:t>
+              <w:t xml:space="preserve">ATD (tàu chạy)</w:t>
             </w:r>
           </w:p>
         </w:tc>
@@ -4148,7 +4907,7 @@
               <w:rPr>
                 <w:b/>
               </w:rPr>
-              <w:t xml:space="preserve">Ngày tiền về</w:t>
+              <w:t xml:space="preserve">Hạn thu</w:t>
             </w:r>
           </w:p>
         </w:tc>
@@ -4169,7 +4928,7 @@
               <w:rPr>
                 <w:b/>
               </w:rPr>
-              <w:t xml:space="preserve">Tuổi nợ</w:t>
+              <w:t xml:space="preserve">Tuổi nợ dự kiến</w:t>
             </w:r>
           </w:p>
         </w:tc>
@@ -4249,8 +5008,21 @@
               <w:spacing w:lineRule="auto"/>
             </w:pPr>
             <w:r>
-              <w:rPr/>
-              <w:t xml:space="preserve">−88</w:t>
+              <w:rPr>
+                <w:b/>
+              </w:rPr>
+              <w:t xml:space="preserve">29/03/2026</w:t>
+            </w:r>
+          </w:p>
+          <w:p>
+            <w:pPr>
+              <w:spacing w:lineRule="auto"/>
+            </w:pPr>
+            <w:r>
+              <w:rPr>
+                <w:color w:val="94a3b8"/>
+              </w:rPr>
+              <w:t xml:space="preserve">(hôm nay −88 ngày)</w:t>
             </w:r>
           </w:p>
         </w:tc>
@@ -4288,7 +5060,7 @@
             </w:pPr>
             <w:r>
               <w:rPr/>
-              <w:t xml:space="preserve">(trống)</w:t>
+              <w:t xml:space="preserve">(để trống)</w:t>
             </w:r>
           </w:p>
         </w:tc>
@@ -4387,8 +5159,21 @@
               <w:spacing w:lineRule="auto"/>
             </w:pPr>
             <w:r>
-              <w:rPr/>
-              <w:t xml:space="preserve">−100</w:t>
+              <w:rPr>
+                <w:b/>
+              </w:rPr>
+              <w:t xml:space="preserve">17/03/2026</w:t>
+            </w:r>
+          </w:p>
+          <w:p>
+            <w:pPr>
+              <w:spacing w:lineRule="auto"/>
+            </w:pPr>
+            <w:r>
+              <w:rPr>
+                <w:color w:val="94a3b8"/>
+              </w:rPr>
+              <w:t xml:space="preserve">(hôm nay −100 ngày)</w:t>
             </w:r>
           </w:p>
         </w:tc>
@@ -4426,7 +5211,7 @@
             </w:pPr>
             <w:r>
               <w:rPr/>
-              <w:t xml:space="preserve">(trống)</w:t>
+              <w:t xml:space="preserve">(để trống)</w:t>
             </w:r>
           </w:p>
         </w:tc>
@@ -4525,8 +5310,21 @@
               <w:spacing w:lineRule="auto"/>
             </w:pPr>
             <w:r>
-              <w:rPr/>
-              <w:t xml:space="preserve">−165</w:t>
+              <w:rPr>
+                <w:b/>
+              </w:rPr>
+              <w:t xml:space="preserve">11/01/2026</w:t>
+            </w:r>
+          </w:p>
+          <w:p>
+            <w:pPr>
+              <w:spacing w:lineRule="auto"/>
+            </w:pPr>
+            <w:r>
+              <w:rPr>
+                <w:color w:val="94a3b8"/>
+              </w:rPr>
+              <w:t xml:space="preserve">(hôm nay −165 ngày)</w:t>
             </w:r>
           </w:p>
         </w:tc>
@@ -4564,7 +5362,7 @@
             </w:pPr>
             <w:r>
               <w:rPr/>
-              <w:t xml:space="preserve">(trống)</w:t>
+              <w:t xml:space="preserve">(để trống)</w:t>
             </w:r>
           </w:p>
         </w:tc>
@@ -4663,8 +5461,21 @@
               <w:spacing w:lineRule="auto"/>
             </w:pPr>
             <w:r>
-              <w:rPr/>
-              <w:t xml:space="preserve">−120</w:t>
+              <w:rPr>
+                <w:b/>
+              </w:rPr>
+              <w:t xml:space="preserve">25/02/2026</w:t>
+            </w:r>
+          </w:p>
+          <w:p>
+            <w:pPr>
+              <w:spacing w:lineRule="auto"/>
+            </w:pPr>
+            <w:r>
+              <w:rPr>
+                <w:color w:val="94a3b8"/>
+              </w:rPr>
+              <w:t xml:space="preserve">(hôm nay −120 ngày)</w:t>
             </w:r>
           </w:p>
         </w:tc>
@@ -4701,8 +5512,21 @@
               <w:spacing w:lineRule="auto"/>
             </w:pPr>
             <w:r>
-              <w:rPr/>
-              <w:t xml:space="preserve">−15</w:t>
+              <w:rPr>
+                <w:b/>
+              </w:rPr>
+              <w:t xml:space="preserve">10/06/2026</w:t>
+            </w:r>
+          </w:p>
+          <w:p>
+            <w:pPr>
+              <w:spacing w:lineRule="auto"/>
+            </w:pPr>
+            <w:r>
+              <w:rPr>
+                <w:color w:val="94a3b8"/>
+              </w:rPr>
+              <w:t xml:space="preserve">(hôm nay −15 ngày)</w:t>
             </w:r>
           </w:p>
         </w:tc>
@@ -4733,6 +5557,143 @@
       </w:pPr>
       <w:r>
         <w:rPr/>
+      </w:r>
+    </w:p>
+    <w:p>
+      <w:pPr>
+        <w:spacing w:lineRule="auto"/>
+      </w:pPr>
+      <w:r>
+        <w:rPr>
+          <w:color w:val="1B4D3E"/>
+          <w:b/>
+        </w:rPr>
+        <w:t xml:space="preserve">📝 Giải thích từng trường:</w:t>
+      </w:r>
+    </w:p>
+    <w:p>
+      <w:pPr>
+        <w:numPr>
+          <w:ilvl w:val="0"/>
+          <w:numId w:val="9"/>
+        </w:numPr>
+        <w:spacing w:lineRule="auto"/>
+      </w:pPr>
+      <w:r>
+        <w:rPr>
+          <w:b/>
+        </w:rPr>
+        <w:t xml:space="preserve">Khách hàng (Buyer) / Số HĐ</w:t>
+      </w:r>
+      <w:r>
+        <w:rPr/>
+        <w:t xml:space="preserve"> — bên mua + hợp đồng xuất khẩu.</w:t>
+      </w:r>
+    </w:p>
+    <w:p>
+      <w:pPr>
+        <w:numPr>
+          <w:ilvl w:val="0"/>
+          <w:numId w:val="9"/>
+        </w:numPr>
+        <w:spacing w:lineRule="auto"/>
+      </w:pPr>
+      <w:r>
+        <w:rPr>
+          <w:b/>
+        </w:rPr>
+        <w:t xml:space="preserve">Tiền tệ / Giá trị</w:t>
+      </w:r>
+      <w:r>
+        <w:rPr/>
+        <w:t xml:space="preserve"> — chọn </w:t>
+      </w:r>
+      <w:r>
+        <w:rPr>
+          <w:b/>
+        </w:rPr>
+        <w:t xml:space="preserve">USD</w:t>
+      </w:r>
+      <w:r>
+        <w:rPr/>
+        <w:t xml:space="preserve"> và nhập số tiền phải thu.</w:t>
+      </w:r>
+    </w:p>
+    <w:p>
+      <w:pPr>
+        <w:numPr>
+          <w:ilvl w:val="0"/>
+          <w:numId w:val="9"/>
+        </w:numPr>
+        <w:spacing w:lineRule="auto"/>
+      </w:pPr>
+      <w:r>
+        <w:rPr>
+          <w:b/>
+        </w:rPr>
+        <w:t xml:space="preserve">ATD</w:t>
+      </w:r>
+      <w:r>
+        <w:rPr/>
+        <w:t xml:space="preserve"> — ngày tàu chạy thực (</w:t>
+      </w:r>
+      <w:r>
+        <w:rPr>
+          <w:i/>
+        </w:rPr>
+        <w:t xml:space="preserve">Actual Time of Departure</w:t>
+      </w:r>
+      <w:r>
+        <w:rPr/>
+        <w:t xml:space="preserve">) — mốc bắt đầu đếm hạn thu.</w:t>
+      </w:r>
+    </w:p>
+    <w:p>
+      <w:pPr>
+        <w:numPr>
+          <w:ilvl w:val="0"/>
+          <w:numId w:val="9"/>
+        </w:numPr>
+        <w:spacing w:lineRule="auto"/>
+      </w:pPr>
+      <w:r>
+        <w:rPr>
+          <w:b/>
+        </w:rPr>
+        <w:t xml:space="preserve">Term (ngày)</w:t>
+      </w:r>
+      <w:r>
+        <w:rPr/>
+        <w:t xml:space="preserve"> — số ngày cho khách nợ (ví dụ 90).</w:t>
+      </w:r>
+    </w:p>
+    <w:p>
+      <w:pPr>
+        <w:numPr>
+          <w:ilvl w:val="0"/>
+          <w:numId w:val="9"/>
+        </w:numPr>
+        <w:spacing w:lineRule="auto"/>
+      </w:pPr>
+      <w:r>
+        <w:rPr>
+          <w:b/>
+        </w:rPr>
+        <w:t xml:space="preserve">Hạn thu</w:t>
+      </w:r>
+      <w:r>
+        <w:rPr/>
+        <w:t xml:space="preserve"> — </w:t>
+      </w:r>
+      <w:r>
+        <w:rPr>
+          <w:b/>
+        </w:rPr>
+        <w:t xml:space="preserve">để TRỐNG</w:t>
+      </w:r>
+      <w:r>
+        <w:rPr/>
+        <w:t xml:space="preserve"> → hệ thống tự tính = ATD + Term; tuổi nợ tính từ ngày này. (Dòng “Đã thu” có nhập ngày tiền về để test trạng thái đã thu.)</w:t>
       </w:r>
     </w:p>
     <w:p>
@@ -5034,6 +5995,85 @@
       </w:pPr>
       <w:r>
         <w:rPr/>
+      </w:r>
+    </w:p>
+    <w:p>
+      <w:pPr>
+        <w:spacing w:lineRule="auto"/>
+      </w:pPr>
+      <w:r>
+        <w:rPr>
+          <w:color w:val="1B4D3E"/>
+          <w:b/>
+        </w:rPr>
+        <w:t xml:space="preserve">📝 Giải thích từng trường:</w:t>
+      </w:r>
+    </w:p>
+    <w:p>
+      <w:pPr>
+        <w:numPr>
+          <w:ilvl w:val="0"/>
+          <w:numId w:val="10"/>
+        </w:numPr>
+        <w:spacing w:lineRule="auto"/>
+      </w:pPr>
+      <w:r>
+        <w:rPr>
+          <w:b/>
+        </w:rPr>
+        <w:t xml:space="preserve">Ngân hàng</w:t>
+      </w:r>
+      <w:r>
+        <w:rPr/>
+        <w:t xml:space="preserve"> — tài khoản ngân hàng.</w:t>
+      </w:r>
+    </w:p>
+    <w:p>
+      <w:pPr>
+        <w:numPr>
+          <w:ilvl w:val="0"/>
+          <w:numId w:val="10"/>
+        </w:numPr>
+        <w:spacing w:lineRule="auto"/>
+      </w:pPr>
+      <w:r>
+        <w:rPr>
+          <w:b/>
+        </w:rPr>
+        <w:t xml:space="preserve">Số dư VNĐ / USD</w:t>
+      </w:r>
+      <w:r>
+        <w:rPr/>
+        <w:t xml:space="preserve"> — số dư hiện tại của từng tài khoản — đây là </w:t>
+      </w:r>
+      <w:r>
+        <w:rPr>
+          <w:b/>
+        </w:rPr>
+        <w:t xml:space="preserve">điểm xuất phát</w:t>
+      </w:r>
+      <w:r>
+        <w:rPr/>
+        <w:t xml:space="preserve"> của Dòng tiền tổng hợp.</w:t>
+      </w:r>
+    </w:p>
+    <w:p>
+      <w:pPr>
+        <w:numPr>
+          <w:ilvl w:val="0"/>
+          <w:numId w:val="10"/>
+        </w:numPr>
+        <w:spacing w:lineRule="auto"/>
+      </w:pPr>
+      <w:r>
+        <w:rPr>
+          <w:b/>
+        </w:rPr>
+        <w:t xml:space="preserve">Cập nhật ngày</w:t>
+      </w:r>
+      <w:r>
+        <w:rPr/>
+        <w:t xml:space="preserve"> — để mặc định HÔM NAY (ngày chốt số dư).</w:t>
       </w:r>
     </w:p>
     <w:p>
@@ -5138,7 +6178,7 @@
               <w:rPr>
                 <w:b/>
               </w:rPr>
-              <w:t xml:space="preserve">Ngày nộp</w:t>
+              <w:t xml:space="preserve">Ngày nộp (1–28)</w:t>
             </w:r>
           </w:p>
         </w:tc>
@@ -5337,6 +6377,95 @@
     </w:p>
     <w:p>
       <w:pPr>
+        <w:spacing w:lineRule="auto"/>
+      </w:pPr>
+      <w:r>
+        <w:rPr>
+          <w:color w:val="1B4D3E"/>
+          <w:b/>
+        </w:rPr>
+        <w:t xml:space="preserve">📝 Giải thích từng trường:</w:t>
+      </w:r>
+    </w:p>
+    <w:p>
+      <w:pPr>
+        <w:numPr>
+          <w:ilvl w:val="0"/>
+          <w:numId w:val="11"/>
+        </w:numPr>
+        <w:spacing w:lineRule="auto"/>
+      </w:pPr>
+      <w:r>
+        <w:rPr>
+          <w:b/>
+        </w:rPr>
+        <w:t xml:space="preserve">Tên / Nhóm</w:t>
+      </w:r>
+      <w:r>
+        <w:rPr/>
+        <w:t xml:space="preserve"> — khoản chi định kỳ (điện, bảo hiểm, thuế…).</w:t>
+      </w:r>
+    </w:p>
+    <w:p>
+      <w:pPr>
+        <w:numPr>
+          <w:ilvl w:val="0"/>
+          <w:numId w:val="11"/>
+        </w:numPr>
+        <w:spacing w:lineRule="auto"/>
+      </w:pPr>
+      <w:r>
+        <w:rPr>
+          <w:b/>
+        </w:rPr>
+        <w:t xml:space="preserve">Ngày nộp (1–28)</w:t>
+      </w:r>
+      <w:r>
+        <w:rPr/>
+        <w:t xml:space="preserve"> — </w:t>
+      </w:r>
+      <w:r>
+        <w:rPr>
+          <w:b/>
+        </w:rPr>
+        <w:t xml:space="preserve">ngày trong tháng</w:t>
+      </w:r>
+      <w:r>
+        <w:rPr/>
+        <w:t xml:space="preserve"> phải nộp (không phải ngày cụ thể) → hệ thống tự suy ra “kỳ tới”.</w:t>
+      </w:r>
+    </w:p>
+    <w:p>
+      <w:pPr>
+        <w:numPr>
+          <w:ilvl w:val="0"/>
+          <w:numId w:val="11"/>
+        </w:numPr>
+        <w:spacing w:lineRule="auto"/>
+      </w:pPr>
+      <w:r>
+        <w:rPr>
+          <w:b/>
+        </w:rPr>
+        <w:t xml:space="preserve">Số tiền ước</w:t>
+      </w:r>
+      <w:r>
+        <w:rPr/>
+        <w:t xml:space="preserve"> — số tiền dự kiến mỗi kỳ — tính vào </w:t>
+      </w:r>
+      <w:r>
+        <w:rPr>
+          <w:b/>
+        </w:rPr>
+        <w:t xml:space="preserve">tiền RA</w:t>
+      </w:r>
+      <w:r>
+        <w:rPr/>
+        <w:t xml:space="preserve"> của dòng tiền.</w:t>
+      </w:r>
+    </w:p>
+    <w:p>
+      <w:pPr>
         <w:pStyle w:val="Heading3"/>
         <w:spacing w:lineRule="auto"/>
       </w:pPr>
@@ -5354,7 +6483,38 @@
       </w:pPr>
       <w:r>
         <w:rPr/>
-        <w:t xml:space="preserve">Trong Drawer → bấm “Sinh lịch”: Kỳ trả lãi </w:t>
+        <w:t xml:space="preserve">Trong Drawer → bấm “Sinh lịch”:</w:t>
+      </w:r>
+    </w:p>
+    <w:p>
+      <w:pPr>
+        <w:spacing w:lineRule="auto"/>
+      </w:pPr>
+      <w:r>
+        <w:rPr>
+          <w:color w:val="1B4D3E"/>
+          <w:b/>
+        </w:rPr>
+        <w:t xml:space="preserve">📝 Giải thích từng trường:</w:t>
+      </w:r>
+    </w:p>
+    <w:p>
+      <w:pPr>
+        <w:numPr>
+          <w:ilvl w:val="0"/>
+          <w:numId w:val="12"/>
+        </w:numPr>
+        <w:spacing w:lineRule="auto"/>
+      </w:pPr>
+      <w:r>
+        <w:rPr>
+          <w:b/>
+        </w:rPr>
+        <w:t xml:space="preserve">Kỳ trả lãi</w:t>
+      </w:r>
+      <w:r>
+        <w:rPr/>
+        <w:t xml:space="preserve"> — chọn </w:t>
       </w:r>
       <w:r>
         <w:rPr>
@@ -5364,7 +6524,26 @@
       </w:r>
       <w:r>
         <w:rPr/>
-        <w:t xml:space="preserve"> · Ngày trả </w:t>
+        <w:t xml:space="preserve">.</w:t>
+      </w:r>
+    </w:p>
+    <w:p>
+      <w:pPr>
+        <w:numPr>
+          <w:ilvl w:val="0"/>
+          <w:numId w:val="12"/>
+        </w:numPr>
+        <w:spacing w:lineRule="auto"/>
+      </w:pPr>
+      <w:r>
+        <w:rPr>
+          <w:b/>
+        </w:rPr>
+        <w:t xml:space="preserve">Ngày trả (1–28)</w:t>
+      </w:r>
+      <w:r>
+        <w:rPr/>
+        <w:t xml:space="preserve"> — nhập </w:t>
       </w:r>
       <w:r>
         <w:rPr>
@@ -5374,7 +6553,26 @@
       </w:r>
       <w:r>
         <w:rPr/>
-        <w:t xml:space="preserve"> · Lãi suất </w:t>
+        <w:t xml:space="preserve"> (ngày trong tháng trả lãi).</w:t>
+      </w:r>
+    </w:p>
+    <w:p>
+      <w:pPr>
+        <w:numPr>
+          <w:ilvl w:val="0"/>
+          <w:numId w:val="12"/>
+        </w:numPr>
+        <w:spacing w:lineRule="auto"/>
+      </w:pPr>
+      <w:r>
+        <w:rPr>
+          <w:b/>
+        </w:rPr>
+        <w:t xml:space="preserve">Lãi suất (%/năm)</w:t>
+      </w:r>
+      <w:r>
+        <w:rPr/>
+        <w:t xml:space="preserve"> — nhập </w:t>
       </w:r>
       <w:r>
         <w:rPr>
@@ -5384,7 +6582,96 @@
       </w:r>
       <w:r>
         <w:rPr/>
-        <w:t xml:space="preserve"> · Từ ngày = ngày giải ngân · Đến ngày = ngày đến hạn · Dư nợ gốc </w:t>
+        <w:t xml:space="preserve">.</w:t>
+      </w:r>
+    </w:p>
+    <w:p>
+      <w:pPr>
+        <w:numPr>
+          <w:ilvl w:val="0"/>
+          <w:numId w:val="12"/>
+        </w:numPr>
+        <w:spacing w:lineRule="auto"/>
+      </w:pPr>
+      <w:r>
+        <w:rPr>
+          <w:b/>
+        </w:rPr>
+        <w:t xml:space="preserve">Từ ngày</w:t>
+      </w:r>
+      <w:r>
+        <w:rPr/>
+        <w:t xml:space="preserve"> — = ngày giải ngân KU-001 = </w:t>
+      </w:r>
+      <w:r>
+        <w:rPr>
+          <w:b/>
+        </w:rPr>
+        <w:t xml:space="preserve">26/04/2026</w:t>
+      </w:r>
+      <w:r>
+        <w:rPr>
+          <w:color w:val="94a3b8"/>
+        </w:rPr>
+        <w:t xml:space="preserve">(hôm nay −60 ngày)</w:t>
+      </w:r>
+      <w:r>
+        <w:rPr/>
+        <w:t xml:space="preserve">.</w:t>
+      </w:r>
+    </w:p>
+    <w:p>
+      <w:pPr>
+        <w:numPr>
+          <w:ilvl w:val="0"/>
+          <w:numId w:val="12"/>
+        </w:numPr>
+        <w:spacing w:lineRule="auto"/>
+      </w:pPr>
+      <w:r>
+        <w:rPr>
+          <w:b/>
+        </w:rPr>
+        <w:t xml:space="preserve">Đến ngày</w:t>
+      </w:r>
+      <w:r>
+        <w:rPr/>
+        <w:t xml:space="preserve"> — = ngày đến hạn KU-001 = </w:t>
+      </w:r>
+      <w:r>
+        <w:rPr>
+          <w:b/>
+        </w:rPr>
+        <w:t xml:space="preserve">15/07/2026</w:t>
+      </w:r>
+      <w:r>
+        <w:rPr>
+          <w:color w:val="94a3b8"/>
+        </w:rPr>
+        <w:t xml:space="preserve">(hôm nay +20 ngày)</w:t>
+      </w:r>
+      <w:r>
+        <w:rPr/>
+        <w:t xml:space="preserve">.</w:t>
+      </w:r>
+    </w:p>
+    <w:p>
+      <w:pPr>
+        <w:numPr>
+          <w:ilvl w:val="0"/>
+          <w:numId w:val="12"/>
+        </w:numPr>
+        <w:spacing w:lineRule="auto"/>
+      </w:pPr>
+      <w:r>
+        <w:rPr>
+          <w:b/>
+        </w:rPr>
+        <w:t xml:space="preserve">Dư nợ gốc</w:t>
+      </w:r>
+      <w:r>
+        <w:rPr/>
+        <w:t xml:space="preserve"> — nhập </w:t>
       </w:r>
       <w:r>
         <w:rPr>
@@ -5394,7 +6681,26 @@
       </w:r>
       <w:r>
         <w:rPr/>
-        <w:t xml:space="preserve">. Bấm ✓ “đã trả” một kỳ cũ để test.</w:t>
+        <w:t xml:space="preserve">.</w:t>
+      </w:r>
+    </w:p>
+    <w:p>
+      <w:pPr>
+        <w:spacing w:lineRule="auto"/>
+      </w:pPr>
+      <w:r>
+        <w:rPr/>
+        <w:t xml:space="preserve">Sau khi sinh: bấm </w:t>
+      </w:r>
+      <w:r>
+        <w:rPr>
+          <w:b/>
+        </w:rPr>
+        <w:t xml:space="preserve">✓ “đã trả”</w:t>
+      </w:r>
+      <w:r>
+        <w:rPr/>
+        <w:t xml:space="preserve"> ở một kỳ cũ nhất để test ghi nhận đã trả lãi.</w:t>
       </w:r>
     </w:p>
     <w:p>
@@ -5415,18 +6721,65 @@
         <w:spacing w:lineRule="auto"/>
       </w:pPr>
       <w:r>
-        <w:rPr/>
-        <w:t xml:space="preserve">Ngày trả </w:t>
-      </w:r>
-      <w:r>
-        <w:rPr>
-          <w:b/>
-        </w:rPr>
-        <w:t xml:space="preserve">−7</w:t>
-      </w:r>
-      <w:r>
-        <w:rPr/>
-        <w:t xml:space="preserve"> · Số tiền </w:t>
+        <w:rPr>
+          <w:color w:val="1B4D3E"/>
+          <w:b/>
+        </w:rPr>
+        <w:t xml:space="preserve">📝 Giải thích từng trường:</w:t>
+      </w:r>
+    </w:p>
+    <w:p>
+      <w:pPr>
+        <w:numPr>
+          <w:ilvl w:val="0"/>
+          <w:numId w:val="13"/>
+        </w:numPr>
+        <w:spacing w:lineRule="auto"/>
+      </w:pPr>
+      <w:r>
+        <w:rPr>
+          <w:b/>
+        </w:rPr>
+        <w:t xml:space="preserve">Ngày trả</w:t>
+      </w:r>
+      <w:r>
+        <w:rPr/>
+        <w:t xml:space="preserve"> — nhập </w:t>
+      </w:r>
+      <w:r>
+        <w:rPr>
+          <w:b/>
+        </w:rPr>
+        <w:t xml:space="preserve">18/06/2026</w:t>
+      </w:r>
+      <w:r>
+        <w:rPr>
+          <w:color w:val="94a3b8"/>
+        </w:rPr>
+        <w:t xml:space="preserve">(hôm nay −7 ngày)</w:t>
+      </w:r>
+      <w:r>
+        <w:rPr/>
+        <w:t xml:space="preserve">.</w:t>
+      </w:r>
+    </w:p>
+    <w:p>
+      <w:pPr>
+        <w:numPr>
+          <w:ilvl w:val="0"/>
+          <w:numId w:val="13"/>
+        </w:numPr>
+        <w:spacing w:lineRule="auto"/>
+      </w:pPr>
+      <w:r>
+        <w:rPr>
+          <w:b/>
+        </w:rPr>
+        <w:t xml:space="preserve">Số tiền</w:t>
+      </w:r>
+      <w:r>
+        <w:rPr/>
+        <w:t xml:space="preserve"> — nhập </w:t>
       </w:r>
       <w:r>
         <w:rPr>
@@ -5436,7 +6789,45 @@
       </w:r>
       <w:r>
         <w:rPr/>
-        <w:t xml:space="preserve"> → dư nợ KU-001 giảm còn 6 tỷ.</w:t>
+        <w:t xml:space="preserve">.</w:t>
+      </w:r>
+    </w:p>
+    <w:p>
+      <w:pPr>
+        <w:numPr>
+          <w:ilvl w:val="0"/>
+          <w:numId w:val="13"/>
+        </w:numPr>
+        <w:spacing w:lineRule="auto"/>
+      </w:pPr>
+      <w:r>
+        <w:rPr>
+          <w:b/>
+        </w:rPr>
+        <w:t xml:space="preserve">Nguồn (nếu có)</w:t>
+      </w:r>
+      <w:r>
+        <w:rPr/>
+        <w:t xml:space="preserve"> — ví dụ “Tiền hàng KH”.</w:t>
+      </w:r>
+    </w:p>
+    <w:p>
+      <w:pPr>
+        <w:spacing w:lineRule="auto"/>
+      </w:pPr>
+      <w:r>
+        <w:rPr/>
+        <w:t xml:space="preserve">✅ Kết quả: dư nợ KU-001 giảm còn </w:t>
+      </w:r>
+      <w:r>
+        <w:rPr>
+          <w:b/>
+        </w:rPr>
+        <w:t xml:space="preserve">6 tỷ</w:t>
+      </w:r>
+      <w:r>
+        <w:rPr/>
+        <w:t xml:space="preserve"> (8 − 2).</w:t>
       </w:r>
     </w:p>
     <w:p>
@@ -6334,6 +7725,1104 @@
       </w:rPr>
     </w:lvl>
   </w:abstractNum>
+  <w:abstractNum w:abstractNumId="5">
+    <w:lvl w:ilvl="0">
+      <w:start w:val="1"/>
+      <w:numFmt w:val="bullet"/>
+      <w:lvlText w:val=""/>
+      <w:lvlJc w:val="left"/>
+      <w:pPr>
+        <w:tabs>
+          <w:tab w:val="num" w:pos="720"/>
+        </w:tabs>
+        <w:ind w:left="720" w:hanging="360"/>
+      </w:pPr>
+      <w:rPr>
+        <w:rFonts w:ascii="Symbol" w:hAnsi="Symbol" w:hint="default"/>
+      </w:rPr>
+    </w:lvl>
+    <w:lvl w:ilvl="1">
+      <w:start w:val="1"/>
+      <w:numFmt w:val="bullet"/>
+      <w:lvlText w:val=""/>
+      <w:lvlJc w:val="left"/>
+      <w:pPr>
+        <w:tabs>
+          <w:tab w:val="num" w:pos="1440"/>
+        </w:tabs>
+        <w:ind w:left="1440" w:hanging="360"/>
+      </w:pPr>
+      <w:rPr>
+        <w:rFonts w:ascii="Symbol" w:hAnsi="Symbol" w:hint="default"/>
+      </w:rPr>
+    </w:lvl>
+    <w:lvl w:ilvl="2">
+      <w:start w:val="1"/>
+      <w:numFmt w:val="bullet"/>
+      <w:lvlText w:val=""/>
+      <w:lvlJc w:val="left"/>
+      <w:pPr>
+        <w:tabs>
+          <w:tab w:val="num" w:pos="2160"/>
+        </w:tabs>
+        <w:ind w:left="2160" w:hanging="360"/>
+      </w:pPr>
+      <w:rPr>
+        <w:rFonts w:ascii="Symbol" w:hAnsi="Symbol" w:hint="default"/>
+      </w:rPr>
+    </w:lvl>
+    <w:lvl w:ilvl="3">
+      <w:start w:val="1"/>
+      <w:numFmt w:val="bullet"/>
+      <w:lvlText w:val=""/>
+      <w:lvlJc w:val="left"/>
+      <w:pPr>
+        <w:tabs>
+          <w:tab w:val="num" w:pos="2880"/>
+        </w:tabs>
+        <w:ind w:left="2880" w:hanging="360"/>
+      </w:pPr>
+      <w:rPr>
+        <w:rFonts w:ascii="Symbol" w:hAnsi="Symbol" w:hint="default"/>
+      </w:rPr>
+    </w:lvl>
+    <w:lvl w:ilvl="4">
+      <w:start w:val="1"/>
+      <w:numFmt w:val="bullet"/>
+      <w:lvlText w:val=""/>
+      <w:lvlJc w:val="left"/>
+      <w:pPr>
+        <w:tabs>
+          <w:tab w:val="num" w:pos="3600"/>
+        </w:tabs>
+        <w:ind w:left="3600" w:hanging="360"/>
+      </w:pPr>
+      <w:rPr>
+        <w:rFonts w:ascii="Symbol" w:hAnsi="Symbol" w:hint="default"/>
+      </w:rPr>
+    </w:lvl>
+    <w:lvl w:ilvl="5">
+      <w:start w:val="1"/>
+      <w:numFmt w:val="bullet"/>
+      <w:lvlText w:val=""/>
+      <w:lvlJc w:val="left"/>
+      <w:pPr>
+        <w:tabs>
+          <w:tab w:val="num" w:pos="4320"/>
+        </w:tabs>
+        <w:ind w:left="4320" w:hanging="360"/>
+      </w:pPr>
+      <w:rPr>
+        <w:rFonts w:ascii="Symbol" w:hAnsi="Symbol" w:hint="default"/>
+      </w:rPr>
+    </w:lvl>
+    <w:lvl w:ilvl="6">
+      <w:start w:val="1"/>
+      <w:numFmt w:val="bullet"/>
+      <w:lvlText w:val=""/>
+      <w:lvlJc w:val="left"/>
+      <w:pPr>
+        <w:tabs>
+          <w:tab w:val="num" w:pos="5040"/>
+        </w:tabs>
+        <w:ind w:left="5040" w:hanging="360"/>
+      </w:pPr>
+      <w:rPr>
+        <w:rFonts w:ascii="Symbol" w:hAnsi="Symbol" w:hint="default"/>
+      </w:rPr>
+    </w:lvl>
+    <w:lvl w:ilvl="7">
+      <w:start w:val="1"/>
+      <w:numFmt w:val="bullet"/>
+      <w:lvlText w:val=""/>
+      <w:lvlJc w:val="left"/>
+      <w:pPr>
+        <w:tabs>
+          <w:tab w:val="num" w:pos="5760"/>
+        </w:tabs>
+        <w:ind w:left="5760" w:hanging="360"/>
+      </w:pPr>
+      <w:rPr>
+        <w:rFonts w:ascii="Symbol" w:hAnsi="Symbol" w:hint="default"/>
+      </w:rPr>
+    </w:lvl>
+  </w:abstractNum>
+  <w:abstractNum w:abstractNumId="6">
+    <w:lvl w:ilvl="0">
+      <w:start w:val="1"/>
+      <w:numFmt w:val="bullet"/>
+      <w:lvlText w:val=""/>
+      <w:lvlJc w:val="left"/>
+      <w:pPr>
+        <w:tabs>
+          <w:tab w:val="num" w:pos="720"/>
+        </w:tabs>
+        <w:ind w:left="720" w:hanging="360"/>
+      </w:pPr>
+      <w:rPr>
+        <w:rFonts w:ascii="Symbol" w:hAnsi="Symbol" w:hint="default"/>
+      </w:rPr>
+    </w:lvl>
+    <w:lvl w:ilvl="1">
+      <w:start w:val="1"/>
+      <w:numFmt w:val="bullet"/>
+      <w:lvlText w:val=""/>
+      <w:lvlJc w:val="left"/>
+      <w:pPr>
+        <w:tabs>
+          <w:tab w:val="num" w:pos="1440"/>
+        </w:tabs>
+        <w:ind w:left="1440" w:hanging="360"/>
+      </w:pPr>
+      <w:rPr>
+        <w:rFonts w:ascii="Symbol" w:hAnsi="Symbol" w:hint="default"/>
+      </w:rPr>
+    </w:lvl>
+    <w:lvl w:ilvl="2">
+      <w:start w:val="1"/>
+      <w:numFmt w:val="bullet"/>
+      <w:lvlText w:val=""/>
+      <w:lvlJc w:val="left"/>
+      <w:pPr>
+        <w:tabs>
+          <w:tab w:val="num" w:pos="2160"/>
+        </w:tabs>
+        <w:ind w:left="2160" w:hanging="360"/>
+      </w:pPr>
+      <w:rPr>
+        <w:rFonts w:ascii="Symbol" w:hAnsi="Symbol" w:hint="default"/>
+      </w:rPr>
+    </w:lvl>
+    <w:lvl w:ilvl="3">
+      <w:start w:val="1"/>
+      <w:numFmt w:val="bullet"/>
+      <w:lvlText w:val=""/>
+      <w:lvlJc w:val="left"/>
+      <w:pPr>
+        <w:tabs>
+          <w:tab w:val="num" w:pos="2880"/>
+        </w:tabs>
+        <w:ind w:left="2880" w:hanging="360"/>
+      </w:pPr>
+      <w:rPr>
+        <w:rFonts w:ascii="Symbol" w:hAnsi="Symbol" w:hint="default"/>
+      </w:rPr>
+    </w:lvl>
+    <w:lvl w:ilvl="4">
+      <w:start w:val="1"/>
+      <w:numFmt w:val="bullet"/>
+      <w:lvlText w:val=""/>
+      <w:lvlJc w:val="left"/>
+      <w:pPr>
+        <w:tabs>
+          <w:tab w:val="num" w:pos="3600"/>
+        </w:tabs>
+        <w:ind w:left="3600" w:hanging="360"/>
+      </w:pPr>
+      <w:rPr>
+        <w:rFonts w:ascii="Symbol" w:hAnsi="Symbol" w:hint="default"/>
+      </w:rPr>
+    </w:lvl>
+    <w:lvl w:ilvl="5">
+      <w:start w:val="1"/>
+      <w:numFmt w:val="bullet"/>
+      <w:lvlText w:val=""/>
+      <w:lvlJc w:val="left"/>
+      <w:pPr>
+        <w:tabs>
+          <w:tab w:val="num" w:pos="4320"/>
+        </w:tabs>
+        <w:ind w:left="4320" w:hanging="360"/>
+      </w:pPr>
+      <w:rPr>
+        <w:rFonts w:ascii="Symbol" w:hAnsi="Symbol" w:hint="default"/>
+      </w:rPr>
+    </w:lvl>
+    <w:lvl w:ilvl="6">
+      <w:start w:val="1"/>
+      <w:numFmt w:val="bullet"/>
+      <w:lvlText w:val=""/>
+      <w:lvlJc w:val="left"/>
+      <w:pPr>
+        <w:tabs>
+          <w:tab w:val="num" w:pos="5040"/>
+        </w:tabs>
+        <w:ind w:left="5040" w:hanging="360"/>
+      </w:pPr>
+      <w:rPr>
+        <w:rFonts w:ascii="Symbol" w:hAnsi="Symbol" w:hint="default"/>
+      </w:rPr>
+    </w:lvl>
+    <w:lvl w:ilvl="7">
+      <w:start w:val="1"/>
+      <w:numFmt w:val="bullet"/>
+      <w:lvlText w:val=""/>
+      <w:lvlJc w:val="left"/>
+      <w:pPr>
+        <w:tabs>
+          <w:tab w:val="num" w:pos="5760"/>
+        </w:tabs>
+        <w:ind w:left="5760" w:hanging="360"/>
+      </w:pPr>
+      <w:rPr>
+        <w:rFonts w:ascii="Symbol" w:hAnsi="Symbol" w:hint="default"/>
+      </w:rPr>
+    </w:lvl>
+  </w:abstractNum>
+  <w:abstractNum w:abstractNumId="7">
+    <w:lvl w:ilvl="0">
+      <w:start w:val="1"/>
+      <w:numFmt w:val="bullet"/>
+      <w:lvlText w:val=""/>
+      <w:lvlJc w:val="left"/>
+      <w:pPr>
+        <w:tabs>
+          <w:tab w:val="num" w:pos="720"/>
+        </w:tabs>
+        <w:ind w:left="720" w:hanging="360"/>
+      </w:pPr>
+      <w:rPr>
+        <w:rFonts w:ascii="Symbol" w:hAnsi="Symbol" w:hint="default"/>
+      </w:rPr>
+    </w:lvl>
+    <w:lvl w:ilvl="1">
+      <w:start w:val="1"/>
+      <w:numFmt w:val="bullet"/>
+      <w:lvlText w:val=""/>
+      <w:lvlJc w:val="left"/>
+      <w:pPr>
+        <w:tabs>
+          <w:tab w:val="num" w:pos="1440"/>
+        </w:tabs>
+        <w:ind w:left="1440" w:hanging="360"/>
+      </w:pPr>
+      <w:rPr>
+        <w:rFonts w:ascii="Symbol" w:hAnsi="Symbol" w:hint="default"/>
+      </w:rPr>
+    </w:lvl>
+    <w:lvl w:ilvl="2">
+      <w:start w:val="1"/>
+      <w:numFmt w:val="bullet"/>
+      <w:lvlText w:val=""/>
+      <w:lvlJc w:val="left"/>
+      <w:pPr>
+        <w:tabs>
+          <w:tab w:val="num" w:pos="2160"/>
+        </w:tabs>
+        <w:ind w:left="2160" w:hanging="360"/>
+      </w:pPr>
+      <w:rPr>
+        <w:rFonts w:ascii="Symbol" w:hAnsi="Symbol" w:hint="default"/>
+      </w:rPr>
+    </w:lvl>
+    <w:lvl w:ilvl="3">
+      <w:start w:val="1"/>
+      <w:numFmt w:val="bullet"/>
+      <w:lvlText w:val=""/>
+      <w:lvlJc w:val="left"/>
+      <w:pPr>
+        <w:tabs>
+          <w:tab w:val="num" w:pos="2880"/>
+        </w:tabs>
+        <w:ind w:left="2880" w:hanging="360"/>
+      </w:pPr>
+      <w:rPr>
+        <w:rFonts w:ascii="Symbol" w:hAnsi="Symbol" w:hint="default"/>
+      </w:rPr>
+    </w:lvl>
+    <w:lvl w:ilvl="4">
+      <w:start w:val="1"/>
+      <w:numFmt w:val="bullet"/>
+      <w:lvlText w:val=""/>
+      <w:lvlJc w:val="left"/>
+      <w:pPr>
+        <w:tabs>
+          <w:tab w:val="num" w:pos="3600"/>
+        </w:tabs>
+        <w:ind w:left="3600" w:hanging="360"/>
+      </w:pPr>
+      <w:rPr>
+        <w:rFonts w:ascii="Symbol" w:hAnsi="Symbol" w:hint="default"/>
+      </w:rPr>
+    </w:lvl>
+    <w:lvl w:ilvl="5">
+      <w:start w:val="1"/>
+      <w:numFmt w:val="bullet"/>
+      <w:lvlText w:val=""/>
+      <w:lvlJc w:val="left"/>
+      <w:pPr>
+        <w:tabs>
+          <w:tab w:val="num" w:pos="4320"/>
+        </w:tabs>
+        <w:ind w:left="4320" w:hanging="360"/>
+      </w:pPr>
+      <w:rPr>
+        <w:rFonts w:ascii="Symbol" w:hAnsi="Symbol" w:hint="default"/>
+      </w:rPr>
+    </w:lvl>
+    <w:lvl w:ilvl="6">
+      <w:start w:val="1"/>
+      <w:numFmt w:val="bullet"/>
+      <w:lvlText w:val=""/>
+      <w:lvlJc w:val="left"/>
+      <w:pPr>
+        <w:tabs>
+          <w:tab w:val="num" w:pos="5040"/>
+        </w:tabs>
+        <w:ind w:left="5040" w:hanging="360"/>
+      </w:pPr>
+      <w:rPr>
+        <w:rFonts w:ascii="Symbol" w:hAnsi="Symbol" w:hint="default"/>
+      </w:rPr>
+    </w:lvl>
+    <w:lvl w:ilvl="7">
+      <w:start w:val="1"/>
+      <w:numFmt w:val="bullet"/>
+      <w:lvlText w:val=""/>
+      <w:lvlJc w:val="left"/>
+      <w:pPr>
+        <w:tabs>
+          <w:tab w:val="num" w:pos="5760"/>
+        </w:tabs>
+        <w:ind w:left="5760" w:hanging="360"/>
+      </w:pPr>
+      <w:rPr>
+        <w:rFonts w:ascii="Symbol" w:hAnsi="Symbol" w:hint="default"/>
+      </w:rPr>
+    </w:lvl>
+  </w:abstractNum>
+  <w:abstractNum w:abstractNumId="8">
+    <w:lvl w:ilvl="0">
+      <w:start w:val="1"/>
+      <w:numFmt w:val="bullet"/>
+      <w:lvlText w:val=""/>
+      <w:lvlJc w:val="left"/>
+      <w:pPr>
+        <w:tabs>
+          <w:tab w:val="num" w:pos="720"/>
+        </w:tabs>
+        <w:ind w:left="720" w:hanging="360"/>
+      </w:pPr>
+      <w:rPr>
+        <w:rFonts w:ascii="Symbol" w:hAnsi="Symbol" w:hint="default"/>
+      </w:rPr>
+    </w:lvl>
+    <w:lvl w:ilvl="1">
+      <w:start w:val="1"/>
+      <w:numFmt w:val="bullet"/>
+      <w:lvlText w:val=""/>
+      <w:lvlJc w:val="left"/>
+      <w:pPr>
+        <w:tabs>
+          <w:tab w:val="num" w:pos="1440"/>
+        </w:tabs>
+        <w:ind w:left="1440" w:hanging="360"/>
+      </w:pPr>
+      <w:rPr>
+        <w:rFonts w:ascii="Symbol" w:hAnsi="Symbol" w:hint="default"/>
+      </w:rPr>
+    </w:lvl>
+    <w:lvl w:ilvl="2">
+      <w:start w:val="1"/>
+      <w:numFmt w:val="bullet"/>
+      <w:lvlText w:val=""/>
+      <w:lvlJc w:val="left"/>
+      <w:pPr>
+        <w:tabs>
+          <w:tab w:val="num" w:pos="2160"/>
+        </w:tabs>
+        <w:ind w:left="2160" w:hanging="360"/>
+      </w:pPr>
+      <w:rPr>
+        <w:rFonts w:ascii="Symbol" w:hAnsi="Symbol" w:hint="default"/>
+      </w:rPr>
+    </w:lvl>
+    <w:lvl w:ilvl="3">
+      <w:start w:val="1"/>
+      <w:numFmt w:val="bullet"/>
+      <w:lvlText w:val=""/>
+      <w:lvlJc w:val="left"/>
+      <w:pPr>
+        <w:tabs>
+          <w:tab w:val="num" w:pos="2880"/>
+        </w:tabs>
+        <w:ind w:left="2880" w:hanging="360"/>
+      </w:pPr>
+      <w:rPr>
+        <w:rFonts w:ascii="Symbol" w:hAnsi="Symbol" w:hint="default"/>
+      </w:rPr>
+    </w:lvl>
+    <w:lvl w:ilvl="4">
+      <w:start w:val="1"/>
+      <w:numFmt w:val="bullet"/>
+      <w:lvlText w:val=""/>
+      <w:lvlJc w:val="left"/>
+      <w:pPr>
+        <w:tabs>
+          <w:tab w:val="num" w:pos="3600"/>
+        </w:tabs>
+        <w:ind w:left="3600" w:hanging="360"/>
+      </w:pPr>
+      <w:rPr>
+        <w:rFonts w:ascii="Symbol" w:hAnsi="Symbol" w:hint="default"/>
+      </w:rPr>
+    </w:lvl>
+    <w:lvl w:ilvl="5">
+      <w:start w:val="1"/>
+      <w:numFmt w:val="bullet"/>
+      <w:lvlText w:val=""/>
+      <w:lvlJc w:val="left"/>
+      <w:pPr>
+        <w:tabs>
+          <w:tab w:val="num" w:pos="4320"/>
+        </w:tabs>
+        <w:ind w:left="4320" w:hanging="360"/>
+      </w:pPr>
+      <w:rPr>
+        <w:rFonts w:ascii="Symbol" w:hAnsi="Symbol" w:hint="default"/>
+      </w:rPr>
+    </w:lvl>
+    <w:lvl w:ilvl="6">
+      <w:start w:val="1"/>
+      <w:numFmt w:val="bullet"/>
+      <w:lvlText w:val=""/>
+      <w:lvlJc w:val="left"/>
+      <w:pPr>
+        <w:tabs>
+          <w:tab w:val="num" w:pos="5040"/>
+        </w:tabs>
+        <w:ind w:left="5040" w:hanging="360"/>
+      </w:pPr>
+      <w:rPr>
+        <w:rFonts w:ascii="Symbol" w:hAnsi="Symbol" w:hint="default"/>
+      </w:rPr>
+    </w:lvl>
+    <w:lvl w:ilvl="7">
+      <w:start w:val="1"/>
+      <w:numFmt w:val="bullet"/>
+      <w:lvlText w:val=""/>
+      <w:lvlJc w:val="left"/>
+      <w:pPr>
+        <w:tabs>
+          <w:tab w:val="num" w:pos="5760"/>
+        </w:tabs>
+        <w:ind w:left="5760" w:hanging="360"/>
+      </w:pPr>
+      <w:rPr>
+        <w:rFonts w:ascii="Symbol" w:hAnsi="Symbol" w:hint="default"/>
+      </w:rPr>
+    </w:lvl>
+  </w:abstractNum>
+  <w:abstractNum w:abstractNumId="9">
+    <w:lvl w:ilvl="0">
+      <w:start w:val="1"/>
+      <w:numFmt w:val="bullet"/>
+      <w:lvlText w:val=""/>
+      <w:lvlJc w:val="left"/>
+      <w:pPr>
+        <w:tabs>
+          <w:tab w:val="num" w:pos="720"/>
+        </w:tabs>
+        <w:ind w:left="720" w:hanging="360"/>
+      </w:pPr>
+      <w:rPr>
+        <w:rFonts w:ascii="Symbol" w:hAnsi="Symbol" w:hint="default"/>
+      </w:rPr>
+    </w:lvl>
+    <w:lvl w:ilvl="1">
+      <w:start w:val="1"/>
+      <w:numFmt w:val="bullet"/>
+      <w:lvlText w:val=""/>
+      <w:lvlJc w:val="left"/>
+      <w:pPr>
+        <w:tabs>
+          <w:tab w:val="num" w:pos="1440"/>
+        </w:tabs>
+        <w:ind w:left="1440" w:hanging="360"/>
+      </w:pPr>
+      <w:rPr>
+        <w:rFonts w:ascii="Symbol" w:hAnsi="Symbol" w:hint="default"/>
+      </w:rPr>
+    </w:lvl>
+    <w:lvl w:ilvl="2">
+      <w:start w:val="1"/>
+      <w:numFmt w:val="bullet"/>
+      <w:lvlText w:val=""/>
+      <w:lvlJc w:val="left"/>
+      <w:pPr>
+        <w:tabs>
+          <w:tab w:val="num" w:pos="2160"/>
+        </w:tabs>
+        <w:ind w:left="2160" w:hanging="360"/>
+      </w:pPr>
+      <w:rPr>
+        <w:rFonts w:ascii="Symbol" w:hAnsi="Symbol" w:hint="default"/>
+      </w:rPr>
+    </w:lvl>
+    <w:lvl w:ilvl="3">
+      <w:start w:val="1"/>
+      <w:numFmt w:val="bullet"/>
+      <w:lvlText w:val=""/>
+      <w:lvlJc w:val="left"/>
+      <w:pPr>
+        <w:tabs>
+          <w:tab w:val="num" w:pos="2880"/>
+        </w:tabs>
+        <w:ind w:left="2880" w:hanging="360"/>
+      </w:pPr>
+      <w:rPr>
+        <w:rFonts w:ascii="Symbol" w:hAnsi="Symbol" w:hint="default"/>
+      </w:rPr>
+    </w:lvl>
+    <w:lvl w:ilvl="4">
+      <w:start w:val="1"/>
+      <w:numFmt w:val="bullet"/>
+      <w:lvlText w:val=""/>
+      <w:lvlJc w:val="left"/>
+      <w:pPr>
+        <w:tabs>
+          <w:tab w:val="num" w:pos="3600"/>
+        </w:tabs>
+        <w:ind w:left="3600" w:hanging="360"/>
+      </w:pPr>
+      <w:rPr>
+        <w:rFonts w:ascii="Symbol" w:hAnsi="Symbol" w:hint="default"/>
+      </w:rPr>
+    </w:lvl>
+    <w:lvl w:ilvl="5">
+      <w:start w:val="1"/>
+      <w:numFmt w:val="bullet"/>
+      <w:lvlText w:val=""/>
+      <w:lvlJc w:val="left"/>
+      <w:pPr>
+        <w:tabs>
+          <w:tab w:val="num" w:pos="4320"/>
+        </w:tabs>
+        <w:ind w:left="4320" w:hanging="360"/>
+      </w:pPr>
+      <w:rPr>
+        <w:rFonts w:ascii="Symbol" w:hAnsi="Symbol" w:hint="default"/>
+      </w:rPr>
+    </w:lvl>
+    <w:lvl w:ilvl="6">
+      <w:start w:val="1"/>
+      <w:numFmt w:val="bullet"/>
+      <w:lvlText w:val=""/>
+      <w:lvlJc w:val="left"/>
+      <w:pPr>
+        <w:tabs>
+          <w:tab w:val="num" w:pos="5040"/>
+        </w:tabs>
+        <w:ind w:left="5040" w:hanging="360"/>
+      </w:pPr>
+      <w:rPr>
+        <w:rFonts w:ascii="Symbol" w:hAnsi="Symbol" w:hint="default"/>
+      </w:rPr>
+    </w:lvl>
+    <w:lvl w:ilvl="7">
+      <w:start w:val="1"/>
+      <w:numFmt w:val="bullet"/>
+      <w:lvlText w:val=""/>
+      <w:lvlJc w:val="left"/>
+      <w:pPr>
+        <w:tabs>
+          <w:tab w:val="num" w:pos="5760"/>
+        </w:tabs>
+        <w:ind w:left="5760" w:hanging="360"/>
+      </w:pPr>
+      <w:rPr>
+        <w:rFonts w:ascii="Symbol" w:hAnsi="Symbol" w:hint="default"/>
+      </w:rPr>
+    </w:lvl>
+  </w:abstractNum>
+  <w:abstractNum w:abstractNumId="10">
+    <w:lvl w:ilvl="0">
+      <w:start w:val="1"/>
+      <w:numFmt w:val="bullet"/>
+      <w:lvlText w:val=""/>
+      <w:lvlJc w:val="left"/>
+      <w:pPr>
+        <w:tabs>
+          <w:tab w:val="num" w:pos="720"/>
+        </w:tabs>
+        <w:ind w:left="720" w:hanging="360"/>
+      </w:pPr>
+      <w:rPr>
+        <w:rFonts w:ascii="Symbol" w:hAnsi="Symbol" w:hint="default"/>
+      </w:rPr>
+    </w:lvl>
+    <w:lvl w:ilvl="1">
+      <w:start w:val="1"/>
+      <w:numFmt w:val="bullet"/>
+      <w:lvlText w:val=""/>
+      <w:lvlJc w:val="left"/>
+      <w:pPr>
+        <w:tabs>
+          <w:tab w:val="num" w:pos="1440"/>
+        </w:tabs>
+        <w:ind w:left="1440" w:hanging="360"/>
+      </w:pPr>
+      <w:rPr>
+        <w:rFonts w:ascii="Symbol" w:hAnsi="Symbol" w:hint="default"/>
+      </w:rPr>
+    </w:lvl>
+    <w:lvl w:ilvl="2">
+      <w:start w:val="1"/>
+      <w:numFmt w:val="bullet"/>
+      <w:lvlText w:val=""/>
+      <w:lvlJc w:val="left"/>
+      <w:pPr>
+        <w:tabs>
+          <w:tab w:val="num" w:pos="2160"/>
+        </w:tabs>
+        <w:ind w:left="2160" w:hanging="360"/>
+      </w:pPr>
+      <w:rPr>
+        <w:rFonts w:ascii="Symbol" w:hAnsi="Symbol" w:hint="default"/>
+      </w:rPr>
+    </w:lvl>
+    <w:lvl w:ilvl="3">
+      <w:start w:val="1"/>
+      <w:numFmt w:val="bullet"/>
+      <w:lvlText w:val=""/>
+      <w:lvlJc w:val="left"/>
+      <w:pPr>
+        <w:tabs>
+          <w:tab w:val="num" w:pos="2880"/>
+        </w:tabs>
+        <w:ind w:left="2880" w:hanging="360"/>
+      </w:pPr>
+      <w:rPr>
+        <w:rFonts w:ascii="Symbol" w:hAnsi="Symbol" w:hint="default"/>
+      </w:rPr>
+    </w:lvl>
+    <w:lvl w:ilvl="4">
+      <w:start w:val="1"/>
+      <w:numFmt w:val="bullet"/>
+      <w:lvlText w:val=""/>
+      <w:lvlJc w:val="left"/>
+      <w:pPr>
+        <w:tabs>
+          <w:tab w:val="num" w:pos="3600"/>
+        </w:tabs>
+        <w:ind w:left="3600" w:hanging="360"/>
+      </w:pPr>
+      <w:rPr>
+        <w:rFonts w:ascii="Symbol" w:hAnsi="Symbol" w:hint="default"/>
+      </w:rPr>
+    </w:lvl>
+    <w:lvl w:ilvl="5">
+      <w:start w:val="1"/>
+      <w:numFmt w:val="bullet"/>
+      <w:lvlText w:val=""/>
+      <w:lvlJc w:val="left"/>
+      <w:pPr>
+        <w:tabs>
+          <w:tab w:val="num" w:pos="4320"/>
+        </w:tabs>
+        <w:ind w:left="4320" w:hanging="360"/>
+      </w:pPr>
+      <w:rPr>
+        <w:rFonts w:ascii="Symbol" w:hAnsi="Symbol" w:hint="default"/>
+      </w:rPr>
+    </w:lvl>
+    <w:lvl w:ilvl="6">
+      <w:start w:val="1"/>
+      <w:numFmt w:val="bullet"/>
+      <w:lvlText w:val=""/>
+      <w:lvlJc w:val="left"/>
+      <w:pPr>
+        <w:tabs>
+          <w:tab w:val="num" w:pos="5040"/>
+        </w:tabs>
+        <w:ind w:left="5040" w:hanging="360"/>
+      </w:pPr>
+      <w:rPr>
+        <w:rFonts w:ascii="Symbol" w:hAnsi="Symbol" w:hint="default"/>
+      </w:rPr>
+    </w:lvl>
+    <w:lvl w:ilvl="7">
+      <w:start w:val="1"/>
+      <w:numFmt w:val="bullet"/>
+      <w:lvlText w:val=""/>
+      <w:lvlJc w:val="left"/>
+      <w:pPr>
+        <w:tabs>
+          <w:tab w:val="num" w:pos="5760"/>
+        </w:tabs>
+        <w:ind w:left="5760" w:hanging="360"/>
+      </w:pPr>
+      <w:rPr>
+        <w:rFonts w:ascii="Symbol" w:hAnsi="Symbol" w:hint="default"/>
+      </w:rPr>
+    </w:lvl>
+  </w:abstractNum>
+  <w:abstractNum w:abstractNumId="11">
+    <w:lvl w:ilvl="0">
+      <w:start w:val="1"/>
+      <w:numFmt w:val="bullet"/>
+      <w:lvlText w:val=""/>
+      <w:lvlJc w:val="left"/>
+      <w:pPr>
+        <w:tabs>
+          <w:tab w:val="num" w:pos="720"/>
+        </w:tabs>
+        <w:ind w:left="720" w:hanging="360"/>
+      </w:pPr>
+      <w:rPr>
+        <w:rFonts w:ascii="Symbol" w:hAnsi="Symbol" w:hint="default"/>
+      </w:rPr>
+    </w:lvl>
+    <w:lvl w:ilvl="1">
+      <w:start w:val="1"/>
+      <w:numFmt w:val="bullet"/>
+      <w:lvlText w:val=""/>
+      <w:lvlJc w:val="left"/>
+      <w:pPr>
+        <w:tabs>
+          <w:tab w:val="num" w:pos="1440"/>
+        </w:tabs>
+        <w:ind w:left="1440" w:hanging="360"/>
+      </w:pPr>
+      <w:rPr>
+        <w:rFonts w:ascii="Symbol" w:hAnsi="Symbol" w:hint="default"/>
+      </w:rPr>
+    </w:lvl>
+    <w:lvl w:ilvl="2">
+      <w:start w:val="1"/>
+      <w:numFmt w:val="bullet"/>
+      <w:lvlText w:val=""/>
+      <w:lvlJc w:val="left"/>
+      <w:pPr>
+        <w:tabs>
+          <w:tab w:val="num" w:pos="2160"/>
+        </w:tabs>
+        <w:ind w:left="2160" w:hanging="360"/>
+      </w:pPr>
+      <w:rPr>
+        <w:rFonts w:ascii="Symbol" w:hAnsi="Symbol" w:hint="default"/>
+      </w:rPr>
+    </w:lvl>
+    <w:lvl w:ilvl="3">
+      <w:start w:val="1"/>
+      <w:numFmt w:val="bullet"/>
+      <w:lvlText w:val=""/>
+      <w:lvlJc w:val="left"/>
+      <w:pPr>
+        <w:tabs>
+          <w:tab w:val="num" w:pos="2880"/>
+        </w:tabs>
+        <w:ind w:left="2880" w:hanging="360"/>
+      </w:pPr>
+      <w:rPr>
+        <w:rFonts w:ascii="Symbol" w:hAnsi="Symbol" w:hint="default"/>
+      </w:rPr>
+    </w:lvl>
+    <w:lvl w:ilvl="4">
+      <w:start w:val="1"/>
+      <w:numFmt w:val="bullet"/>
+      <w:lvlText w:val=""/>
+      <w:lvlJc w:val="left"/>
+      <w:pPr>
+        <w:tabs>
+          <w:tab w:val="num" w:pos="3600"/>
+        </w:tabs>
+        <w:ind w:left="3600" w:hanging="360"/>
+      </w:pPr>
+      <w:rPr>
+        <w:rFonts w:ascii="Symbol" w:hAnsi="Symbol" w:hint="default"/>
+      </w:rPr>
+    </w:lvl>
+    <w:lvl w:ilvl="5">
+      <w:start w:val="1"/>
+      <w:numFmt w:val="bullet"/>
+      <w:lvlText w:val=""/>
+      <w:lvlJc w:val="left"/>
+      <w:pPr>
+        <w:tabs>
+          <w:tab w:val="num" w:pos="4320"/>
+        </w:tabs>
+        <w:ind w:left="4320" w:hanging="360"/>
+      </w:pPr>
+      <w:rPr>
+        <w:rFonts w:ascii="Symbol" w:hAnsi="Symbol" w:hint="default"/>
+      </w:rPr>
+    </w:lvl>
+    <w:lvl w:ilvl="6">
+      <w:start w:val="1"/>
+      <w:numFmt w:val="bullet"/>
+      <w:lvlText w:val=""/>
+      <w:lvlJc w:val="left"/>
+      <w:pPr>
+        <w:tabs>
+          <w:tab w:val="num" w:pos="5040"/>
+        </w:tabs>
+        <w:ind w:left="5040" w:hanging="360"/>
+      </w:pPr>
+      <w:rPr>
+        <w:rFonts w:ascii="Symbol" w:hAnsi="Symbol" w:hint="default"/>
+      </w:rPr>
+    </w:lvl>
+    <w:lvl w:ilvl="7">
+      <w:start w:val="1"/>
+      <w:numFmt w:val="bullet"/>
+      <w:lvlText w:val=""/>
+      <w:lvlJc w:val="left"/>
+      <w:pPr>
+        <w:tabs>
+          <w:tab w:val="num" w:pos="5760"/>
+        </w:tabs>
+        <w:ind w:left="5760" w:hanging="360"/>
+      </w:pPr>
+      <w:rPr>
+        <w:rFonts w:ascii="Symbol" w:hAnsi="Symbol" w:hint="default"/>
+      </w:rPr>
+    </w:lvl>
+  </w:abstractNum>
+  <w:abstractNum w:abstractNumId="12">
+    <w:lvl w:ilvl="0">
+      <w:start w:val="1"/>
+      <w:numFmt w:val="bullet"/>
+      <w:lvlText w:val=""/>
+      <w:lvlJc w:val="left"/>
+      <w:pPr>
+        <w:tabs>
+          <w:tab w:val="num" w:pos="720"/>
+        </w:tabs>
+        <w:ind w:left="720" w:hanging="360"/>
+      </w:pPr>
+      <w:rPr>
+        <w:rFonts w:ascii="Symbol" w:hAnsi="Symbol" w:hint="default"/>
+      </w:rPr>
+    </w:lvl>
+    <w:lvl w:ilvl="1">
+      <w:start w:val="1"/>
+      <w:numFmt w:val="bullet"/>
+      <w:lvlText w:val=""/>
+      <w:lvlJc w:val="left"/>
+      <w:pPr>
+        <w:tabs>
+          <w:tab w:val="num" w:pos="1440"/>
+        </w:tabs>
+        <w:ind w:left="1440" w:hanging="360"/>
+      </w:pPr>
+      <w:rPr>
+        <w:rFonts w:ascii="Symbol" w:hAnsi="Symbol" w:hint="default"/>
+      </w:rPr>
+    </w:lvl>
+    <w:lvl w:ilvl="2">
+      <w:start w:val="1"/>
+      <w:numFmt w:val="bullet"/>
+      <w:lvlText w:val=""/>
+      <w:lvlJc w:val="left"/>
+      <w:pPr>
+        <w:tabs>
+          <w:tab w:val="num" w:pos="2160"/>
+        </w:tabs>
+        <w:ind w:left="2160" w:hanging="360"/>
+      </w:pPr>
+      <w:rPr>
+        <w:rFonts w:ascii="Symbol" w:hAnsi="Symbol" w:hint="default"/>
+      </w:rPr>
+    </w:lvl>
+    <w:lvl w:ilvl="3">
+      <w:start w:val="1"/>
+      <w:numFmt w:val="bullet"/>
+      <w:lvlText w:val=""/>
+      <w:lvlJc w:val="left"/>
+      <w:pPr>
+        <w:tabs>
+          <w:tab w:val="num" w:pos="2880"/>
+        </w:tabs>
+        <w:ind w:left="2880" w:hanging="360"/>
+      </w:pPr>
+      <w:rPr>
+        <w:rFonts w:ascii="Symbol" w:hAnsi="Symbol" w:hint="default"/>
+      </w:rPr>
+    </w:lvl>
+    <w:lvl w:ilvl="4">
+      <w:start w:val="1"/>
+      <w:numFmt w:val="bullet"/>
+      <w:lvlText w:val=""/>
+      <w:lvlJc w:val="left"/>
+      <w:pPr>
+        <w:tabs>
+          <w:tab w:val="num" w:pos="3600"/>
+        </w:tabs>
+        <w:ind w:left="3600" w:hanging="360"/>
+      </w:pPr>
+      <w:rPr>
+        <w:rFonts w:ascii="Symbol" w:hAnsi="Symbol" w:hint="default"/>
+      </w:rPr>
+    </w:lvl>
+    <w:lvl w:ilvl="5">
+      <w:start w:val="1"/>
+      <w:numFmt w:val="bullet"/>
+      <w:lvlText w:val=""/>
+      <w:lvlJc w:val="left"/>
+      <w:pPr>
+        <w:tabs>
+          <w:tab w:val="num" w:pos="4320"/>
+        </w:tabs>
+        <w:ind w:left="4320" w:hanging="360"/>
+      </w:pPr>
+      <w:rPr>
+        <w:rFonts w:ascii="Symbol" w:hAnsi="Symbol" w:hint="default"/>
+      </w:rPr>
+    </w:lvl>
+    <w:lvl w:ilvl="6">
+      <w:start w:val="1"/>
+      <w:numFmt w:val="bullet"/>
+      <w:lvlText w:val=""/>
+      <w:lvlJc w:val="left"/>
+      <w:pPr>
+        <w:tabs>
+          <w:tab w:val="num" w:pos="5040"/>
+        </w:tabs>
+        <w:ind w:left="5040" w:hanging="360"/>
+      </w:pPr>
+      <w:rPr>
+        <w:rFonts w:ascii="Symbol" w:hAnsi="Symbol" w:hint="default"/>
+      </w:rPr>
+    </w:lvl>
+    <w:lvl w:ilvl="7">
+      <w:start w:val="1"/>
+      <w:numFmt w:val="bullet"/>
+      <w:lvlText w:val=""/>
+      <w:lvlJc w:val="left"/>
+      <w:pPr>
+        <w:tabs>
+          <w:tab w:val="num" w:pos="5760"/>
+        </w:tabs>
+        <w:ind w:left="5760" w:hanging="360"/>
+      </w:pPr>
+      <w:rPr>
+        <w:rFonts w:ascii="Symbol" w:hAnsi="Symbol" w:hint="default"/>
+      </w:rPr>
+    </w:lvl>
+  </w:abstractNum>
+  <w:abstractNum w:abstractNumId="13">
+    <w:lvl w:ilvl="0">
+      <w:start w:val="1"/>
+      <w:numFmt w:val="bullet"/>
+      <w:lvlText w:val=""/>
+      <w:lvlJc w:val="left"/>
+      <w:pPr>
+        <w:tabs>
+          <w:tab w:val="num" w:pos="720"/>
+        </w:tabs>
+        <w:ind w:left="720" w:hanging="360"/>
+      </w:pPr>
+      <w:rPr>
+        <w:rFonts w:ascii="Symbol" w:hAnsi="Symbol" w:hint="default"/>
+      </w:rPr>
+    </w:lvl>
+    <w:lvl w:ilvl="1">
+      <w:start w:val="1"/>
+      <w:numFmt w:val="bullet"/>
+      <w:lvlText w:val=""/>
+      <w:lvlJc w:val="left"/>
+      <w:pPr>
+        <w:tabs>
+          <w:tab w:val="num" w:pos="1440"/>
+        </w:tabs>
+        <w:ind w:left="1440" w:hanging="360"/>
+      </w:pPr>
+      <w:rPr>
+        <w:rFonts w:ascii="Symbol" w:hAnsi="Symbol" w:hint="default"/>
+      </w:rPr>
+    </w:lvl>
+    <w:lvl w:ilvl="2">
+      <w:start w:val="1"/>
+      <w:numFmt w:val="bullet"/>
+      <w:lvlText w:val=""/>
+      <w:lvlJc w:val="left"/>
+      <w:pPr>
+        <w:tabs>
+          <w:tab w:val="num" w:pos="2160"/>
+        </w:tabs>
+        <w:ind w:left="2160" w:hanging="360"/>
+      </w:pPr>
+      <w:rPr>
+        <w:rFonts w:ascii="Symbol" w:hAnsi="Symbol" w:hint="default"/>
+      </w:rPr>
+    </w:lvl>
+    <w:lvl w:ilvl="3">
+      <w:start w:val="1"/>
+      <w:numFmt w:val="bullet"/>
+      <w:lvlText w:val=""/>
+      <w:lvlJc w:val="left"/>
+      <w:pPr>
+        <w:tabs>
+          <w:tab w:val="num" w:pos="2880"/>
+        </w:tabs>
+        <w:ind w:left="2880" w:hanging="360"/>
+      </w:pPr>
+      <w:rPr>
+        <w:rFonts w:ascii="Symbol" w:hAnsi="Symbol" w:hint="default"/>
+      </w:rPr>
+    </w:lvl>
+    <w:lvl w:ilvl="4">
+      <w:start w:val="1"/>
+      <w:numFmt w:val="bullet"/>
+      <w:lvlText w:val=""/>
+      <w:lvlJc w:val="left"/>
+      <w:pPr>
+        <w:tabs>
+          <w:tab w:val="num" w:pos="3600"/>
+        </w:tabs>
+        <w:ind w:left="3600" w:hanging="360"/>
+      </w:pPr>
+      <w:rPr>
+        <w:rFonts w:ascii="Symbol" w:hAnsi="Symbol" w:hint="default"/>
+      </w:rPr>
+    </w:lvl>
+    <w:lvl w:ilvl="5">
+      <w:start w:val="1"/>
+      <w:numFmt w:val="bullet"/>
+      <w:lvlText w:val=""/>
+      <w:lvlJc w:val="left"/>
+      <w:pPr>
+        <w:tabs>
+          <w:tab w:val="num" w:pos="4320"/>
+        </w:tabs>
+        <w:ind w:left="4320" w:hanging="360"/>
+      </w:pPr>
+      <w:rPr>
+        <w:rFonts w:ascii="Symbol" w:hAnsi="Symbol" w:hint="default"/>
+      </w:rPr>
+    </w:lvl>
+    <w:lvl w:ilvl="6">
+      <w:start w:val="1"/>
+      <w:numFmt w:val="bullet"/>
+      <w:lvlText w:val=""/>
+      <w:lvlJc w:val="left"/>
+      <w:pPr>
+        <w:tabs>
+          <w:tab w:val="num" w:pos="5040"/>
+        </w:tabs>
+        <w:ind w:left="5040" w:hanging="360"/>
+      </w:pPr>
+      <w:rPr>
+        <w:rFonts w:ascii="Symbol" w:hAnsi="Symbol" w:hint="default"/>
+      </w:rPr>
+    </w:lvl>
+    <w:lvl w:ilvl="7">
+      <w:start w:val="1"/>
+      <w:numFmt w:val="bullet"/>
+      <w:lvlText w:val=""/>
+      <w:lvlJc w:val="left"/>
+      <w:pPr>
+        <w:tabs>
+          <w:tab w:val="num" w:pos="5760"/>
+        </w:tabs>
+        <w:ind w:left="5760" w:hanging="360"/>
+      </w:pPr>
+      <w:rPr>
+        <w:rFonts w:ascii="Symbol" w:hAnsi="Symbol" w:hint="default"/>
+      </w:rPr>
+    </w:lvl>
+  </w:abstractNum>
   <w:num w:numId="1">
     <w:abstractNumId w:val="1"/>
   </w:num>
@@ -6345,6 +8834,33 @@
   </w:num>
   <w:num w:numId="4">
     <w:abstractNumId w:val="4"/>
+  </w:num>
+  <w:num w:numId="5">
+    <w:abstractNumId w:val="5"/>
+  </w:num>
+  <w:num w:numId="6">
+    <w:abstractNumId w:val="6"/>
+  </w:num>
+  <w:num w:numId="7">
+    <w:abstractNumId w:val="7"/>
+  </w:num>
+  <w:num w:numId="8">
+    <w:abstractNumId w:val="8"/>
+  </w:num>
+  <w:num w:numId="9">
+    <w:abstractNumId w:val="9"/>
+  </w:num>
+  <w:num w:numId="10">
+    <w:abstractNumId w:val="10"/>
+  </w:num>
+  <w:num w:numId="11">
+    <w:abstractNumId w:val="11"/>
+  </w:num>
+  <w:num w:numId="12">
+    <w:abstractNumId w:val="12"/>
+  </w:num>
+  <w:num w:numId="13">
+    <w:abstractNumId w:val="13"/>
   </w:num>
 </w:numbering>
 </file>

</xml_diff>